<commit_message>
Update daily and weekly research for 2026-07-18
</commit_message>
<xml_diff>
--- a/public/investor-downloads/daily-brief-2026-07-18.docx
+++ b/public/investor-downloads/daily-brief-2026-07-18.docx
@@ -8,7 +8,7 @@
       </w:pPr>
       <w:r>
         <w:rPr>
-          <w:rFonts w:ascii="Calibri" w:hAnsi="Calibri" w:eastAsia="Heiti TC"/>
+          <w:rFonts w:ascii="Calibri" w:hAnsi="Calibri" w:eastAsia="Arial Unicode MS"/>
           <w:b/>
           <w:i w:val="0"/>
           <w:color w:val="285B9D"/>
@@ -24,7 +24,7 @@
       </w:pPr>
       <w:r>
         <w:rPr>
-          <w:rFonts w:ascii="Calibri" w:hAnsi="Calibri" w:eastAsia="Heiti TC"/>
+          <w:rFonts w:ascii="Calibri" w:hAnsi="Calibri" w:eastAsia="Arial Unicode MS"/>
           <w:b w:val="0"/>
           <w:i w:val="0"/>
         </w:rPr>
@@ -38,7 +38,7 @@
       </w:pPr>
       <w:r>
         <w:rPr>
-          <w:rFonts w:ascii="Calibri" w:hAnsi="Calibri" w:eastAsia="Heiti TC"/>
+          <w:rFonts w:ascii="Calibri" w:hAnsi="Calibri" w:eastAsia="Arial Unicode MS"/>
           <w:b w:val="0"/>
           <w:i w:val="0"/>
         </w:rPr>
@@ -51,7 +51,7 @@
       </w:pPr>
       <w:r>
         <w:rPr>
-          <w:rFonts w:ascii="Calibri" w:hAnsi="Calibri" w:eastAsia="Heiti TC"/>
+          <w:rFonts w:ascii="Calibri" w:hAnsi="Calibri" w:eastAsia="Arial Unicode MS"/>
           <w:b/>
           <w:i w:val="0"/>
           <w:color w:val="0B2545"/>
@@ -66,13 +66,13 @@
       </w:pPr>
       <w:r>
         <w:rPr>
-          <w:rFonts w:ascii="Calibri" w:hAnsi="Calibri" w:eastAsia="Heiti TC"/>
+          <w:rFonts w:ascii="Calibri" w:hAnsi="Calibri" w:eastAsia="Arial Unicode MS"/>
           <w:b w:val="0"/>
           <w:i w:val="0"/>
           <w:color w:val="334155"/>
           <w:sz w:val="22"/>
         </w:rPr>
-        <w:t>2026-07-18 共纳入 47 篇中文研究结果，覆盖 0 位活跃分析师和 5 条主要行业链，较 2026-07-17 的主题变化可在右侧动量表中核对。简报优先呈现可被报告链接追溯的结论，而不是孤立摘要。</w:t>
+        <w:t>2026-07-18 共纳入 92 篇中文研究结果，覆盖 0 位活跃分析师和 5 条主要行业链，较 2026-07-17 的主题变化可在右侧动量表中核对。简报优先呈现可被报告链接追溯的结论，而不是孤立摘要。</w:t>
       </w:r>
     </w:p>
     <w:tbl>
@@ -101,7 +101,7 @@
             </w:pPr>
             <w:r>
               <w:rPr>
-                <w:rFonts w:ascii="Calibri" w:hAnsi="Calibri" w:eastAsia="Heiti TC"/>
+                <w:rFonts w:ascii="Calibri" w:hAnsi="Calibri" w:eastAsia="Arial Unicode MS"/>
                 <w:b/>
                 <w:color w:val="667085"/>
                 <w:sz w:val="17"/>
@@ -111,12 +111,12 @@
             </w:r>
             <w:r>
               <w:rPr>
-                <w:rFonts w:ascii="Calibri" w:hAnsi="Calibri" w:eastAsia="Heiti TC"/>
+                <w:rFonts w:ascii="Calibri" w:hAnsi="Calibri" w:eastAsia="Arial Unicode MS"/>
                 <w:b/>
                 <w:color w:val="285B9D"/>
                 <w:sz w:val="36"/>
               </w:rPr>
-              <w:t>47</w:t>
+              <w:t>92</w:t>
             </w:r>
           </w:p>
         </w:tc>
@@ -132,7 +132,7 @@
             </w:pPr>
             <w:r>
               <w:rPr>
-                <w:rFonts w:ascii="Calibri" w:hAnsi="Calibri" w:eastAsia="Heiti TC"/>
+                <w:rFonts w:ascii="Calibri" w:hAnsi="Calibri" w:eastAsia="Arial Unicode MS"/>
                 <w:b/>
                 <w:color w:val="667085"/>
                 <w:sz w:val="17"/>
@@ -142,7 +142,7 @@
             </w:r>
             <w:r>
               <w:rPr>
-                <w:rFonts w:ascii="Calibri" w:hAnsi="Calibri" w:eastAsia="Heiti TC"/>
+                <w:rFonts w:ascii="Calibri" w:hAnsi="Calibri" w:eastAsia="Arial Unicode MS"/>
                 <w:b/>
                 <w:color w:val="237A5B"/>
                 <w:sz w:val="36"/>
@@ -163,7 +163,7 @@
             </w:pPr>
             <w:r>
               <w:rPr>
-                <w:rFonts w:ascii="Calibri" w:hAnsi="Calibri" w:eastAsia="Heiti TC"/>
+                <w:rFonts w:ascii="Calibri" w:hAnsi="Calibri" w:eastAsia="Arial Unicode MS"/>
                 <w:b/>
                 <w:color w:val="667085"/>
                 <w:sz w:val="17"/>
@@ -173,7 +173,7 @@
             </w:r>
             <w:r>
               <w:rPr>
-                <w:rFonts w:ascii="Calibri" w:hAnsi="Calibri" w:eastAsia="Heiti TC"/>
+                <w:rFonts w:ascii="Calibri" w:hAnsi="Calibri" w:eastAsia="Arial Unicode MS"/>
                 <w:b/>
                 <w:color w:val="A8731B"/>
                 <w:sz w:val="36"/>
@@ -194,7 +194,7 @@
             </w:pPr>
             <w:r>
               <w:rPr>
-                <w:rFonts w:ascii="Calibri" w:hAnsi="Calibri" w:eastAsia="Heiti TC"/>
+                <w:rFonts w:ascii="Calibri" w:hAnsi="Calibri" w:eastAsia="Arial Unicode MS"/>
                 <w:b/>
                 <w:color w:val="667085"/>
                 <w:sz w:val="17"/>
@@ -204,7 +204,7 @@
             </w:r>
             <w:r>
               <w:rPr>
-                <w:rFonts w:ascii="Calibri" w:hAnsi="Calibri" w:eastAsia="Heiti TC"/>
+                <w:rFonts w:ascii="Calibri" w:hAnsi="Calibri" w:eastAsia="Arial Unicode MS"/>
                 <w:b/>
                 <w:color w:val="B43D49"/>
                 <w:sz w:val="36"/>
@@ -268,7 +268,7 @@
       </w:pPr>
       <w:r>
         <w:rPr>
-          <w:rFonts w:ascii="Calibri" w:hAnsi="Calibri" w:eastAsia="Heiti TC"/>
+          <w:rFonts w:ascii="Calibri" w:hAnsi="Calibri" w:eastAsia="Arial Unicode MS"/>
           <w:b w:val="0"/>
           <w:i/>
           <w:color w:val="667085"/>
@@ -292,7 +292,7 @@
       </w:pPr>
       <w:r>
         <w:rPr>
-          <w:rFonts w:ascii="Calibri" w:hAnsi="Calibri" w:eastAsia="Heiti TC"/>
+          <w:rFonts w:ascii="Calibri" w:hAnsi="Calibri" w:eastAsia="Arial Unicode MS"/>
           <w:b/>
           <w:color w:val="285B9D"/>
           <w:sz w:val="21"/>
@@ -304,7 +304,7 @@
           <w:rPr>
             <w:color w:val="285B9D"/>
             <w:u w:val="single"/>
-            <w:rFonts w:eastAsia="Heiti TC" w:ascii="Calibri" w:hAnsi="Calibri"/>
+            <w:rFonts w:eastAsia="Arial Unicode MS" w:ascii="Calibri" w:hAnsi="Calibri"/>
           </w:rPr>
           <w:t>AI 电力瓶颈租金由谁捕获、成本由谁承担？ 是今日最高权重结论，核心证据来自 未识别，关联 AI 基础设施。</w:t>
         </w:r>
@@ -317,7 +317,7 @@
       </w:pPr>
       <w:r>
         <w:rPr>
-          <w:rFonts w:ascii="Calibri" w:hAnsi="Calibri" w:eastAsia="Heiti TC"/>
+          <w:rFonts w:ascii="Calibri" w:hAnsi="Calibri" w:eastAsia="Arial Unicode MS"/>
           <w:b/>
           <w:color w:val="285B9D"/>
           <w:sz w:val="21"/>
@@ -326,11 +326,11 @@
       </w:r>
       <w:r>
         <w:rPr>
-          <w:rFonts w:ascii="Calibri" w:hAnsi="Calibri" w:eastAsia="Heiti TC"/>
+          <w:rFonts w:ascii="Calibri" w:hAnsi="Calibri" w:eastAsia="Arial Unicode MS"/>
           <w:color w:val="111827"/>
           <w:sz w:val="21"/>
         </w:rPr>
-        <w:t>通胀 今日 降温，当日计数 42，前一日计数 288。</w:t>
+        <w:t>通胀 今日 降温，当日计数 83，前一日计数 293。</w:t>
       </w:r>
     </w:p>
     <w:p>
@@ -340,7 +340,7 @@
       </w:pPr>
       <w:r>
         <w:rPr>
-          <w:rFonts w:ascii="Calibri" w:hAnsi="Calibri" w:eastAsia="Heiti TC"/>
+          <w:rFonts w:ascii="Calibri" w:hAnsi="Calibri" w:eastAsia="Arial Unicode MS"/>
           <w:b/>
           <w:color w:val="285B9D"/>
           <w:sz w:val="21"/>
@@ -352,7 +352,7 @@
           <w:rPr>
             <w:color w:val="285B9D"/>
             <w:u w:val="single"/>
-            <w:rFonts w:eastAsia="Heiti TC" w:ascii="Calibri" w:hAnsi="Calibri"/>
+            <w:rFonts w:eastAsia="Arial Unicode MS" w:ascii="Calibri" w:hAnsi="Calibri"/>
           </w:rPr>
           <w:t>风险矩阵最需要跟踪的是 AI 基础设施：挑战："Exit code 0"。</w:t>
         </w:r>
@@ -365,7 +365,7 @@
       </w:pPr>
       <w:r>
         <w:rPr>
-          <w:rFonts w:ascii="Calibri" w:hAnsi="Calibri" w:eastAsia="Heiti TC"/>
+          <w:rFonts w:ascii="Calibri" w:hAnsi="Calibri" w:eastAsia="Arial Unicode MS"/>
           <w:b/>
           <w:color w:val="285B9D"/>
           <w:sz w:val="21"/>
@@ -377,9 +377,9 @@
           <w:rPr>
             <w:color w:val="285B9D"/>
             <w:u w:val="single"/>
-            <w:rFonts w:eastAsia="Heiti TC" w:ascii="Calibri" w:hAnsi="Calibri"/>
+            <w:rFonts w:eastAsia="Arial Unicode MS" w:ascii="Calibri" w:hAnsi="Calibri"/>
           </w:rPr>
-          <w:t>宏观通胀传导 今日 44 条、近七日 1365 条，风险信号 852 条。</w:t>
+          <w:t>宏观通胀传导 今日 86 条、近七日 1415 条，风险信号 883 条。</w:t>
         </w:r>
       </w:hyperlink>
     </w:p>
@@ -403,7 +403,7 @@
           <w:p>
             <w:r>
               <w:rPr>
-                <w:rFonts w:ascii="Calibri" w:hAnsi="Calibri" w:eastAsia="Heiti TC"/>
+                <w:rFonts w:ascii="Calibri" w:hAnsi="Calibri" w:eastAsia="Arial Unicode MS"/>
                 <w:b/>
                 <w:color w:val="7A5A00"/>
                 <w:sz w:val="21"/>
@@ -412,7 +412,7 @@
             </w:r>
             <w:r>
               <w:rPr>
-                <w:rFonts w:ascii="Calibri" w:hAnsi="Calibri" w:eastAsia="Heiti TC"/>
+                <w:rFonts w:ascii="Calibri" w:hAnsi="Calibri" w:eastAsia="Arial Unicode MS"/>
                 <w:color w:val="7C2D12"/>
                 <w:sz w:val="21"/>
               </w:rPr>
@@ -483,7 +483,7 @@
       </w:pPr>
       <w:r>
         <w:rPr>
-          <w:rFonts w:ascii="Calibri" w:hAnsi="Calibri" w:eastAsia="Heiti TC"/>
+          <w:rFonts w:ascii="Calibri" w:hAnsi="Calibri" w:eastAsia="Arial Unicode MS"/>
           <w:b w:val="0"/>
           <w:i/>
           <w:color w:val="667085"/>
@@ -540,7 +540,7 @@
       </w:pPr>
       <w:r>
         <w:rPr>
-          <w:rFonts w:ascii="Calibri" w:hAnsi="Calibri" w:eastAsia="Heiti TC"/>
+          <w:rFonts w:ascii="Calibri" w:hAnsi="Calibri" w:eastAsia="Arial Unicode MS"/>
           <w:b w:val="0"/>
           <w:i/>
           <w:color w:val="667085"/>
@@ -602,7 +602,7 @@
       </w:pPr>
       <w:r>
         <w:rPr>
-          <w:rFonts w:ascii="Calibri" w:hAnsi="Calibri" w:eastAsia="Heiti TC"/>
+          <w:rFonts w:ascii="Calibri" w:hAnsi="Calibri" w:eastAsia="Arial Unicode MS"/>
           <w:b w:val="0"/>
           <w:i/>
           <w:color w:val="667085"/>
@@ -664,7 +664,7 @@
       </w:pPr>
       <w:r>
         <w:rPr>
-          <w:rFonts w:ascii="Calibri" w:hAnsi="Calibri" w:eastAsia="Heiti TC"/>
+          <w:rFonts w:ascii="Calibri" w:hAnsi="Calibri" w:eastAsia="Arial Unicode MS"/>
           <w:b w:val="0"/>
           <w:i/>
           <w:color w:val="667085"/>
@@ -687,7 +687,7 @@
       </w:pPr>
       <w:r>
         <w:rPr>
-          <w:rFonts w:ascii="Calibri" w:hAnsi="Calibri" w:eastAsia="Heiti TC"/>
+          <w:rFonts w:ascii="Calibri" w:hAnsi="Calibri" w:eastAsia="Arial Unicode MS"/>
           <w:b/>
           <w:i w:val="0"/>
           <w:color w:val="0B2545"/>
@@ -702,7 +702,7 @@
       </w:pPr>
       <w:r>
         <w:rPr>
-          <w:rFonts w:ascii="Calibri" w:hAnsi="Calibri" w:eastAsia="Heiti TC"/>
+          <w:rFonts w:ascii="Calibri" w:hAnsi="Calibri" w:eastAsia="Arial Unicode MS"/>
           <w:b w:val="0"/>
           <w:i w:val="0"/>
           <w:color w:val="667085"/>
@@ -717,7 +717,7 @@
       </w:pPr>
       <w:r>
         <w:rPr>
-          <w:rFonts w:ascii="Calibri" w:hAnsi="Calibri" w:eastAsia="Heiti TC"/>
+          <w:rFonts w:ascii="Calibri" w:hAnsi="Calibri" w:eastAsia="Arial Unicode MS"/>
           <w:b w:val="0"/>
           <w:i w:val="0"/>
           <w:color w:val="334155"/>
@@ -732,7 +732,7 @@
       </w:pPr>
       <w:r>
         <w:rPr>
-          <w:rFonts w:ascii="Calibri" w:hAnsi="Calibri" w:eastAsia="Heiti TC"/>
+          <w:rFonts w:ascii="Calibri" w:hAnsi="Calibri" w:eastAsia="Arial Unicode MS"/>
           <w:b w:val="0"/>
           <w:i w:val="0"/>
           <w:color w:val="667085"/>
@@ -745,7 +745,7 @@
           <w:rPr>
             <w:color w:val="285B9D"/>
             <w:u w:val="single"/>
-            <w:rFonts w:eastAsia="Heiti TC" w:ascii="Calibri" w:hAnsi="Calibri"/>
+            <w:rFonts w:eastAsia="Arial Unicode MS" w:ascii="Calibri" w:hAnsi="Calibri"/>
           </w:rPr>
           <w:t>reports/archive-2b1708473d38</w:t>
         </w:r>
@@ -757,13 +757,13 @@
       </w:pPr>
       <w:r>
         <w:rPr>
-          <w:rFonts w:ascii="Calibri" w:hAnsi="Calibri" w:eastAsia="Heiti TC"/>
+          <w:rFonts w:ascii="Calibri" w:hAnsi="Calibri" w:eastAsia="Arial Unicode MS"/>
           <w:b/>
           <w:i w:val="0"/>
           <w:color w:val="0B2545"/>
           <w:sz w:val="23"/>
         </w:rPr>
-        <w:t>2. 自备电源只是把 time-to-power 瓶颈搬家，并没有消除它</w:t>
+        <w:t>2. 2026-07-18｜AI基础设施压力测试：capex、GPU集群利用率与电力约束</w:t>
       </w:r>
     </w:p>
     <w:p>
@@ -772,7 +772,77 @@
       </w:pPr>
       <w:r>
         <w:rPr>
-          <w:rFonts w:ascii="Calibri" w:hAnsi="Calibri" w:eastAsia="Heiti TC"/>
+          <w:rFonts w:ascii="Calibri" w:hAnsi="Calibri" w:eastAsia="Arial Unicode MS"/>
+          <w:b w:val="0"/>
+          <w:i w:val="0"/>
+          <w:color w:val="667085"/>
+          <w:sz w:val="17"/>
+        </w:rPr>
+        <w:t>未识别 · AI 基础设施 · score 46.9</w:t>
+      </w:r>
+    </w:p>
+    <w:p>
+      <w:pPr>
+        <w:spacing w:before="0" w:after="100" w:line="264" w:lineRule="auto"/>
+      </w:pPr>
+      <w:r>
+        <w:rPr>
+          <w:rFonts w:ascii="Calibri" w:hAnsi="Calibri" w:eastAsia="Arial Unicode MS"/>
+          <w:b w:val="0"/>
+          <w:i w:val="0"/>
+          <w:color w:val="334155"/>
+          <w:sz w:val="20"/>
+        </w:rPr>
+        <w:t>2026-07-18｜AI基础设施压力测试：capex、GPU集群利用率与电力约束</w:t>
+      </w:r>
+    </w:p>
+    <w:p>
+      <w:pPr>
+        <w:spacing w:before="0" w:after="160" w:line="264" w:lineRule="auto"/>
+      </w:pPr>
+      <w:r>
+        <w:rPr>
+          <w:rFonts w:ascii="Calibri" w:hAnsi="Calibri" w:eastAsia="Arial Unicode MS"/>
+          <w:b w:val="0"/>
+          <w:i w:val="0"/>
+          <w:color w:val="667085"/>
+          <w:sz w:val="17"/>
+        </w:rPr>
+        <w:t xml:space="preserve">Report: </w:t>
+      </w:r>
+      <w:hyperlink r:id="rId19">
+        <w:r>
+          <w:rPr>
+            <w:color w:val="285B9D"/>
+            <w:u w:val="single"/>
+            <w:rFonts w:eastAsia="Arial Unicode MS" w:ascii="Calibri" w:hAnsi="Calibri"/>
+          </w:rPr>
+          <w:t>reports/archive-5fd507219068</w:t>
+        </w:r>
+      </w:hyperlink>
+    </w:p>
+    <w:p>
+      <w:pPr>
+        <w:spacing w:before="0" w:after="40" w:line="264" w:lineRule="auto"/>
+      </w:pPr>
+      <w:r>
+        <w:rPr>
+          <w:rFonts w:ascii="Calibri" w:hAnsi="Calibri" w:eastAsia="Arial Unicode MS"/>
+          <w:b/>
+          <w:i w:val="0"/>
+          <w:color w:val="0B2545"/>
+          <w:sz w:val="23"/>
+        </w:rPr>
+        <w:t>3. 自备电源只是把 time-to-power 瓶颈搬家，并没有消除它</w:t>
+      </w:r>
+    </w:p>
+    <w:p>
+      <w:pPr>
+        <w:spacing w:before="0" w:after="40" w:line="264" w:lineRule="auto"/>
+      </w:pPr>
+      <w:r>
+        <w:rPr>
+          <w:rFonts w:ascii="Calibri" w:hAnsi="Calibri" w:eastAsia="Arial Unicode MS"/>
           <w:b w:val="0"/>
           <w:i w:val="0"/>
           <w:color w:val="667085"/>
@@ -787,7 +857,7 @@
       </w:pPr>
       <w:r>
         <w:rPr>
-          <w:rFonts w:ascii="Calibri" w:hAnsi="Calibri" w:eastAsia="Heiti TC"/>
+          <w:rFonts w:ascii="Calibri" w:hAnsi="Calibri" w:eastAsia="Arial Unicode MS"/>
           <w:b w:val="0"/>
           <w:i w:val="0"/>
           <w:color w:val="334155"/>
@@ -802,7 +872,7 @@
       </w:pPr>
       <w:r>
         <w:rPr>
-          <w:rFonts w:ascii="Calibri" w:hAnsi="Calibri" w:eastAsia="Heiti TC"/>
+          <w:rFonts w:ascii="Calibri" w:hAnsi="Calibri" w:eastAsia="Arial Unicode MS"/>
           <w:b w:val="0"/>
           <w:i w:val="0"/>
           <w:color w:val="667085"/>
@@ -810,12 +880,12 @@
         </w:rPr>
         <w:t xml:space="preserve">Report: </w:t>
       </w:r>
-      <w:hyperlink r:id="rId19">
+      <w:hyperlink r:id="rId20">
         <w:r>
           <w:rPr>
             <w:color w:val="285B9D"/>
             <w:u w:val="single"/>
-            <w:rFonts w:eastAsia="Heiti TC" w:ascii="Calibri" w:hAnsi="Calibri"/>
+            <w:rFonts w:eastAsia="Arial Unicode MS" w:ascii="Calibri" w:hAnsi="Calibri"/>
           </w:rPr>
           <w:t>reports/archive-a18cc6271319</w:t>
         </w:r>
@@ -827,13 +897,13 @@
       </w:pPr>
       <w:r>
         <w:rPr>
-          <w:rFonts w:ascii="Calibri" w:hAnsi="Calibri" w:eastAsia="Heiti TC"/>
+          <w:rFonts w:ascii="Calibri" w:hAnsi="Calibri" w:eastAsia="Arial Unicode MS"/>
           <w:b/>
           <w:i w:val="0"/>
           <w:color w:val="0B2545"/>
           <w:sz w:val="23"/>
         </w:rPr>
-        <w:t>3. 电力与电网瓶颈已成为 AI 算力的稀缺期权 - 工作日 2026-07-18</w:t>
+        <w:t>4. 电力与电网瓶颈已成为 AI 算力的稀缺期权 - 工作日 2026-07-18</w:t>
       </w:r>
     </w:p>
     <w:p>
@@ -842,7 +912,7 @@
       </w:pPr>
       <w:r>
         <w:rPr>
-          <w:rFonts w:ascii="Calibri" w:hAnsi="Calibri" w:eastAsia="Heiti TC"/>
+          <w:rFonts w:ascii="Calibri" w:hAnsi="Calibri" w:eastAsia="Arial Unicode MS"/>
           <w:b w:val="0"/>
           <w:i w:val="0"/>
           <w:color w:val="667085"/>
@@ -857,7 +927,7 @@
       </w:pPr>
       <w:r>
         <w:rPr>
-          <w:rFonts w:ascii="Calibri" w:hAnsi="Calibri" w:eastAsia="Heiti TC"/>
+          <w:rFonts w:ascii="Calibri" w:hAnsi="Calibri" w:eastAsia="Arial Unicode MS"/>
           <w:b w:val="0"/>
           <w:i w:val="0"/>
           <w:color w:val="334155"/>
@@ -872,7 +942,7 @@
       </w:pPr>
       <w:r>
         <w:rPr>
-          <w:rFonts w:ascii="Calibri" w:hAnsi="Calibri" w:eastAsia="Heiti TC"/>
+          <w:rFonts w:ascii="Calibri" w:hAnsi="Calibri" w:eastAsia="Arial Unicode MS"/>
           <w:b w:val="0"/>
           <w:i w:val="0"/>
           <w:color w:val="667085"/>
@@ -880,12 +950,12 @@
         </w:rPr>
         <w:t xml:space="preserve">Report: </w:t>
       </w:r>
-      <w:hyperlink r:id="rId20">
+      <w:hyperlink r:id="rId21">
         <w:r>
           <w:rPr>
             <w:color w:val="285B9D"/>
             <w:u w:val="single"/>
-            <w:rFonts w:eastAsia="Heiti TC" w:ascii="Calibri" w:hAnsi="Calibri"/>
+            <w:rFonts w:eastAsia="Arial Unicode MS" w:ascii="Calibri" w:hAnsi="Calibri"/>
           </w:rPr>
           <w:t>reports/archive-1e9f3da9f615</w:t>
         </w:r>
@@ -897,13 +967,13 @@
       </w:pPr>
       <w:r>
         <w:rPr>
-          <w:rFonts w:ascii="Calibri" w:hAnsi="Calibri" w:eastAsia="Heiti TC"/>
+          <w:rFonts w:ascii="Calibri" w:hAnsi="Calibri" w:eastAsia="Arial Unicode MS"/>
           <w:b/>
           <w:i w:val="0"/>
           <w:color w:val="0B2545"/>
           <w:sz w:val="23"/>
         </w:rPr>
-        <w:t>4. research discussion Session Brief</w:t>
+        <w:t>5. research discussion Session Brief</w:t>
       </w:r>
     </w:p>
     <w:p>
@@ -912,7 +982,7 @@
       </w:pPr>
       <w:r>
         <w:rPr>
-          <w:rFonts w:ascii="Calibri" w:hAnsi="Calibri" w:eastAsia="Heiti TC"/>
+          <w:rFonts w:ascii="Calibri" w:hAnsi="Calibri" w:eastAsia="Arial Unicode MS"/>
           <w:b w:val="0"/>
           <w:i w:val="0"/>
           <w:color w:val="667085"/>
@@ -927,7 +997,7 @@
       </w:pPr>
       <w:r>
         <w:rPr>
-          <w:rFonts w:ascii="Calibri" w:hAnsi="Calibri" w:eastAsia="Heiti TC"/>
+          <w:rFonts w:ascii="Calibri" w:hAnsi="Calibri" w:eastAsia="Arial Unicode MS"/>
           <w:b w:val="0"/>
           <w:i w:val="0"/>
           <w:color w:val="334155"/>
@@ -942,7 +1012,7 @@
       </w:pPr>
       <w:r>
         <w:rPr>
-          <w:rFonts w:ascii="Calibri" w:hAnsi="Calibri" w:eastAsia="Heiti TC"/>
+          <w:rFonts w:ascii="Calibri" w:hAnsi="Calibri" w:eastAsia="Arial Unicode MS"/>
           <w:b w:val="0"/>
           <w:i w:val="0"/>
           <w:color w:val="667085"/>
@@ -950,12 +1020,12 @@
         </w:rPr>
         <w:t xml:space="preserve">Report: </w:t>
       </w:r>
-      <w:hyperlink r:id="rId21">
+      <w:hyperlink r:id="rId22">
         <w:r>
           <w:rPr>
             <w:color w:val="285B9D"/>
             <w:u w:val="single"/>
-            <w:rFonts w:eastAsia="Heiti TC" w:ascii="Calibri" w:hAnsi="Calibri"/>
+            <w:rFonts w:eastAsia="Arial Unicode MS" w:ascii="Calibri" w:hAnsi="Calibri"/>
           </w:rPr>
           <w:t>reports/archive-b2ac921675b5</w:t>
         </w:r>
@@ -967,13 +1037,13 @@
       </w:pPr>
       <w:r>
         <w:rPr>
-          <w:rFonts w:ascii="Calibri" w:hAnsi="Calibri" w:eastAsia="Heiti TC"/>
+          <w:rFonts w:ascii="Calibri" w:hAnsi="Calibri" w:eastAsia="Arial Unicode MS"/>
           <w:b/>
           <w:i w:val="0"/>
           <w:color w:val="0B2545"/>
           <w:sz w:val="23"/>
         </w:rPr>
-        <w:t>5. 2026-07-18：+600 bps AI电力篮子的因子与拥挤度监控</w:t>
+        <w:t>6. 2026-07-18：+600 bps AI电力篮子的因子与拥挤度监控</w:t>
       </w:r>
     </w:p>
     <w:p>
@@ -982,7 +1052,7 @@
       </w:pPr>
       <w:r>
         <w:rPr>
-          <w:rFonts w:ascii="Calibri" w:hAnsi="Calibri" w:eastAsia="Heiti TC"/>
+          <w:rFonts w:ascii="Calibri" w:hAnsi="Calibri" w:eastAsia="Arial Unicode MS"/>
           <w:b w:val="0"/>
           <w:i w:val="0"/>
           <w:color w:val="667085"/>
@@ -997,7 +1067,7 @@
       </w:pPr>
       <w:r>
         <w:rPr>
-          <w:rFonts w:ascii="Calibri" w:hAnsi="Calibri" w:eastAsia="Heiti TC"/>
+          <w:rFonts w:ascii="Calibri" w:hAnsi="Calibri" w:eastAsia="Arial Unicode MS"/>
           <w:b w:val="0"/>
           <w:i w:val="0"/>
           <w:color w:val="334155"/>
@@ -1012,77 +1082,7 @@
       </w:pPr>
       <w:r>
         <w:rPr>
-          <w:rFonts w:ascii="Calibri" w:hAnsi="Calibri" w:eastAsia="Heiti TC"/>
-          <w:b w:val="0"/>
-          <w:i w:val="0"/>
-          <w:color w:val="667085"/>
-          <w:sz w:val="17"/>
-        </w:rPr>
-        <w:t xml:space="preserve">Report: </w:t>
-      </w:r>
-      <w:hyperlink r:id="rId22">
-        <w:r>
-          <w:rPr>
-            <w:color w:val="285B9D"/>
-            <w:u w:val="single"/>
-            <w:rFonts w:eastAsia="Heiti TC" w:ascii="Calibri" w:hAnsi="Calibri"/>
-          </w:rPr>
-          <w:t>reports/archive-c2ebdfb52193</w:t>
-        </w:r>
-      </w:hyperlink>
-    </w:p>
-    <w:p>
-      <w:pPr>
-        <w:spacing w:before="0" w:after="40" w:line="264" w:lineRule="auto"/>
-      </w:pPr>
-      <w:r>
-        <w:rPr>
-          <w:rFonts w:ascii="Calibri" w:hAnsi="Calibri" w:eastAsia="Heiti TC"/>
-          <w:b/>
-          <w:i w:val="0"/>
-          <w:color w:val="0B2545"/>
-          <w:sz w:val="23"/>
-        </w:rPr>
-        <w:t>6. AI 芯片风险降档后的跨资产杠铃配置 - 2026-07-18</w:t>
-      </w:r>
-    </w:p>
-    <w:p>
-      <w:pPr>
-        <w:spacing w:before="0" w:after="40" w:line="264" w:lineRule="auto"/>
-      </w:pPr>
-      <w:r>
-        <w:rPr>
-          <w:rFonts w:ascii="Calibri" w:hAnsi="Calibri" w:eastAsia="Heiti TC"/>
-          <w:b w:val="0"/>
-          <w:i w:val="0"/>
-          <w:color w:val="667085"/>
-          <w:sz w:val="17"/>
-        </w:rPr>
-        <w:t>未识别 · 半导体与存储 · score 43.5</w:t>
-      </w:r>
-    </w:p>
-    <w:p>
-      <w:pPr>
-        <w:spacing w:before="0" w:after="100" w:line="264" w:lineRule="auto"/>
-      </w:pPr>
-      <w:r>
-        <w:rPr>
-          <w:rFonts w:ascii="Calibri" w:hAnsi="Calibri" w:eastAsia="Heiti TC"/>
-          <w:b w:val="0"/>
-          <w:i w:val="0"/>
-          <w:color w:val="334155"/>
-          <w:sz w:val="20"/>
-        </w:rPr>
-        <w:t>工作日期：2026-07-18，Asia/Singapore，已用 date +%Y-%m-%d 确认返回 2026-07-18 [自测算：shell 命令输出]。本报告综合 prior research notes从 100 单位半导体风险降到 65 单位风险的行业结...</w:t>
-      </w:r>
-    </w:p>
-    <w:p>
-      <w:pPr>
-        <w:spacing w:before="0" w:after="160" w:line="264" w:lineRule="auto"/>
-      </w:pPr>
-      <w:r>
-        <w:rPr>
-          <w:rFonts w:ascii="Calibri" w:hAnsi="Calibri" w:eastAsia="Heiti TC"/>
+          <w:rFonts w:ascii="Calibri" w:hAnsi="Calibri" w:eastAsia="Arial Unicode MS"/>
           <w:b w:val="0"/>
           <w:i w:val="0"/>
           <w:color w:val="667085"/>
@@ -1095,9 +1095,9 @@
           <w:rPr>
             <w:color w:val="285B9D"/>
             <w:u w:val="single"/>
-            <w:rFonts w:eastAsia="Heiti TC" w:ascii="Calibri" w:hAnsi="Calibri"/>
+            <w:rFonts w:eastAsia="Arial Unicode MS" w:ascii="Calibri" w:hAnsi="Calibri"/>
           </w:rPr>
-          <w:t>reports/archive-021bbf175011</w:t>
+          <w:t>reports/archive-c2ebdfb52193</w:t>
         </w:r>
       </w:hyperlink>
     </w:p>
@@ -1115,7 +1115,7 @@
       </w:pPr>
       <w:r>
         <w:rPr>
-          <w:rFonts w:ascii="Calibri" w:hAnsi="Calibri" w:eastAsia="Heiti TC"/>
+          <w:rFonts w:ascii="Calibri" w:hAnsi="Calibri" w:eastAsia="Arial Unicode MS"/>
           <w:b/>
           <w:i w:val="0"/>
           <w:color w:val="0B2545"/>
@@ -1130,7 +1130,7 @@
       </w:pPr>
       <w:r>
         <w:rPr>
-          <w:rFonts w:ascii="Calibri" w:hAnsi="Calibri" w:eastAsia="Heiti TC"/>
+          <w:rFonts w:ascii="Calibri" w:hAnsi="Calibri" w:eastAsia="Arial Unicode MS"/>
           <w:b w:val="0"/>
           <w:i w:val="0"/>
           <w:color w:val="334155"/>
@@ -1145,7 +1145,7 @@
       </w:pPr>
       <w:r>
         <w:rPr>
-          <w:rFonts w:ascii="Calibri" w:hAnsi="Calibri" w:eastAsia="Heiti TC"/>
+          <w:rFonts w:ascii="Calibri" w:hAnsi="Calibri" w:eastAsia="Arial Unicode MS"/>
           <w:b w:val="0"/>
           <w:i w:val="0"/>
           <w:color w:val="667085"/>
@@ -1158,7 +1158,7 @@
           <w:rPr>
             <w:color w:val="285B9D"/>
             <w:u w:val="single"/>
-            <w:rFonts w:eastAsia="Heiti TC" w:ascii="Calibri" w:hAnsi="Calibri"/>
+            <w:rFonts w:eastAsia="Arial Unicode MS" w:ascii="Calibri" w:hAnsi="Calibri"/>
           </w:rPr>
           <w:t>reports/archive-349ffb9e27d6</w:t>
         </w:r>
@@ -1170,7 +1170,7 @@
       </w:pPr>
       <w:r>
         <w:rPr>
-          <w:rFonts w:ascii="Calibri" w:hAnsi="Calibri" w:eastAsia="Heiti TC"/>
+          <w:rFonts w:ascii="Calibri" w:hAnsi="Calibri" w:eastAsia="Arial Unicode MS"/>
           <w:b/>
           <w:i w:val="0"/>
           <w:color w:val="0B2545"/>
@@ -1185,7 +1185,7 @@
       </w:pPr>
       <w:r>
         <w:rPr>
-          <w:rFonts w:ascii="Calibri" w:hAnsi="Calibri" w:eastAsia="Heiti TC"/>
+          <w:rFonts w:ascii="Calibri" w:hAnsi="Calibri" w:eastAsia="Arial Unicode MS"/>
           <w:b w:val="0"/>
           <w:i w:val="0"/>
           <w:color w:val="334155"/>
@@ -1200,7 +1200,7 @@
       </w:pPr>
       <w:r>
         <w:rPr>
-          <w:rFonts w:ascii="Calibri" w:hAnsi="Calibri" w:eastAsia="Heiti TC"/>
+          <w:rFonts w:ascii="Calibri" w:hAnsi="Calibri" w:eastAsia="Arial Unicode MS"/>
           <w:b w:val="0"/>
           <w:i w:val="0"/>
           <w:color w:val="667085"/>
@@ -1213,7 +1213,7 @@
           <w:rPr>
             <w:color w:val="285B9D"/>
             <w:u w:val="single"/>
-            <w:rFonts w:eastAsia="Heiti TC" w:ascii="Calibri" w:hAnsi="Calibri"/>
+            <w:rFonts w:eastAsia="Arial Unicode MS" w:ascii="Calibri" w:hAnsi="Calibri"/>
           </w:rPr>
           <w:t>reports/archive-0b2a1e542de3</w:t>
         </w:r>
@@ -1225,7 +1225,7 @@
       </w:pPr>
       <w:r>
         <w:rPr>
-          <w:rFonts w:ascii="Calibri" w:hAnsi="Calibri" w:eastAsia="Heiti TC"/>
+          <w:rFonts w:ascii="Calibri" w:hAnsi="Calibri" w:eastAsia="Arial Unicode MS"/>
           <w:b/>
           <w:i w:val="0"/>
           <w:color w:val="0B2545"/>
@@ -1240,7 +1240,7 @@
       </w:pPr>
       <w:r>
         <w:rPr>
-          <w:rFonts w:ascii="Calibri" w:hAnsi="Calibri" w:eastAsia="Heiti TC"/>
+          <w:rFonts w:ascii="Calibri" w:hAnsi="Calibri" w:eastAsia="Arial Unicode MS"/>
           <w:b w:val="0"/>
           <w:i w:val="0"/>
           <w:color w:val="334155"/>
@@ -1255,7 +1255,7 @@
       </w:pPr>
       <w:r>
         <w:rPr>
-          <w:rFonts w:ascii="Calibri" w:hAnsi="Calibri" w:eastAsia="Heiti TC"/>
+          <w:rFonts w:ascii="Calibri" w:hAnsi="Calibri" w:eastAsia="Arial Unicode MS"/>
           <w:b w:val="0"/>
           <w:i w:val="0"/>
           <w:color w:val="667085"/>
@@ -1268,7 +1268,7 @@
           <w:rPr>
             <w:color w:val="285B9D"/>
             <w:u w:val="single"/>
-            <w:rFonts w:eastAsia="Heiti TC" w:ascii="Calibri" w:hAnsi="Calibri"/>
+            <w:rFonts w:eastAsia="Arial Unicode MS" w:ascii="Calibri" w:hAnsi="Calibri"/>
           </w:rPr>
           <w:t>reports/archive-623f725af36d</w:t>
         </w:r>
@@ -1311,7 +1311,7 @@
             <w:r/>
             <w:r>
               <w:rPr>
-                <w:rFonts w:ascii="Calibri" w:hAnsi="Calibri" w:eastAsia="Heiti TC"/>
+                <w:rFonts w:ascii="Calibri" w:hAnsi="Calibri" w:eastAsia="Arial Unicode MS"/>
                 <w:b/>
                 <w:color w:val="475569"/>
                 <w:sz w:val="18"/>
@@ -1334,7 +1334,7 @@
             <w:r/>
             <w:r>
               <w:rPr>
-                <w:rFonts w:ascii="Calibri" w:hAnsi="Calibri" w:eastAsia="Heiti TC"/>
+                <w:rFonts w:ascii="Calibri" w:hAnsi="Calibri" w:eastAsia="Arial Unicode MS"/>
                 <w:b/>
                 <w:color w:val="475569"/>
                 <w:sz w:val="18"/>
@@ -1357,7 +1357,7 @@
             <w:r/>
             <w:r>
               <w:rPr>
-                <w:rFonts w:ascii="Calibri" w:hAnsi="Calibri" w:eastAsia="Heiti TC"/>
+                <w:rFonts w:ascii="Calibri" w:hAnsi="Calibri" w:eastAsia="Arial Unicode MS"/>
                 <w:b/>
                 <w:color w:val="475569"/>
                 <w:sz w:val="18"/>
@@ -1380,7 +1380,7 @@
             <w:r/>
             <w:r>
               <w:rPr>
-                <w:rFonts w:ascii="Calibri" w:hAnsi="Calibri" w:eastAsia="Heiti TC"/>
+                <w:rFonts w:ascii="Calibri" w:hAnsi="Calibri" w:eastAsia="Arial Unicode MS"/>
                 <w:b/>
                 <w:color w:val="475569"/>
                 <w:sz w:val="18"/>
@@ -1403,7 +1403,7 @@
             <w:r/>
             <w:r>
               <w:rPr>
-                <w:rFonts w:ascii="Calibri" w:hAnsi="Calibri" w:eastAsia="Heiti TC"/>
+                <w:rFonts w:ascii="Calibri" w:hAnsi="Calibri" w:eastAsia="Arial Unicode MS"/>
                 <w:b/>
                 <w:color w:val="475569"/>
                 <w:sz w:val="18"/>
@@ -1426,7 +1426,7 @@
             <w:r/>
             <w:r>
               <w:rPr>
-                <w:rFonts w:ascii="Calibri" w:hAnsi="Calibri" w:eastAsia="Heiti TC"/>
+                <w:rFonts w:ascii="Calibri" w:hAnsi="Calibri" w:eastAsia="Arial Unicode MS"/>
                 <w:b w:val="0"/>
                 <w:color w:val="111827"/>
                 <w:sz w:val="17"/>
@@ -1447,7 +1447,7 @@
             <w:r/>
             <w:r>
               <w:rPr>
-                <w:rFonts w:ascii="Calibri" w:hAnsi="Calibri" w:eastAsia="Heiti TC"/>
+                <w:rFonts w:ascii="Calibri" w:hAnsi="Calibri" w:eastAsia="Arial Unicode MS"/>
                 <w:b w:val="0"/>
                 <w:color w:val="111827"/>
                 <w:sz w:val="16"/>
@@ -1468,7 +1468,7 @@
             <w:r/>
             <w:r>
               <w:rPr>
-                <w:rFonts w:ascii="Calibri" w:hAnsi="Calibri" w:eastAsia="Heiti TC"/>
+                <w:rFonts w:ascii="Calibri" w:hAnsi="Calibri" w:eastAsia="Arial Unicode MS"/>
                 <w:b w:val="0"/>
                 <w:color w:val="111827"/>
                 <w:sz w:val="16"/>
@@ -1490,7 +1490,7 @@
             <w:r/>
             <w:r>
               <w:rPr>
-                <w:rFonts w:ascii="Calibri" w:hAnsi="Calibri" w:eastAsia="Heiti TC"/>
+                <w:rFonts w:ascii="Calibri" w:hAnsi="Calibri" w:eastAsia="Arial Unicode MS"/>
                 <w:b/>
                 <w:color w:val="111827"/>
                 <w:sz w:val="17"/>
@@ -1512,7 +1512,7 @@
             <w:r/>
             <w:r>
               <w:rPr>
-                <w:rFonts w:ascii="Calibri" w:hAnsi="Calibri" w:eastAsia="Heiti TC"/>
+                <w:rFonts w:ascii="Calibri" w:hAnsi="Calibri" w:eastAsia="Arial Unicode MS"/>
                 <w:b w:val="0"/>
                 <w:color w:val="111827"/>
                 <w:sz w:val="16"/>
@@ -1535,12 +1535,12 @@
             <w:r/>
             <w:r>
               <w:rPr>
-                <w:rFonts w:ascii="Calibri" w:hAnsi="Calibri" w:eastAsia="Heiti TC"/>
+                <w:rFonts w:ascii="Calibri" w:hAnsi="Calibri" w:eastAsia="Arial Unicode MS"/>
                 <w:b w:val="0"/>
                 <w:color w:val="111827"/>
                 <w:sz w:val="17"/>
               </w:rPr>
-              <w:t>自备电源只是把 time-to-power 瓶颈搬家，并没有消除它</w:t>
+              <w:t>2026-07-18｜AI基础设施压力测试：capex、GPU集群利用率与电力约束</w:t>
             </w:r>
           </w:p>
         </w:tc>
@@ -1556,7 +1556,7 @@
             <w:r/>
             <w:r>
               <w:rPr>
-                <w:rFonts w:ascii="Calibri" w:hAnsi="Calibri" w:eastAsia="Heiti TC"/>
+                <w:rFonts w:ascii="Calibri" w:hAnsi="Calibri" w:eastAsia="Arial Unicode MS"/>
                 <w:b w:val="0"/>
                 <w:color w:val="111827"/>
                 <w:sz w:val="16"/>
@@ -1577,12 +1577,12 @@
             <w:r/>
             <w:r>
               <w:rPr>
-                <w:rFonts w:ascii="Calibri" w:hAnsi="Calibri" w:eastAsia="Heiti TC"/>
+                <w:rFonts w:ascii="Calibri" w:hAnsi="Calibri" w:eastAsia="Arial Unicode MS"/>
                 <w:b w:val="0"/>
                 <w:color w:val="111827"/>
                 <w:sz w:val="16"/>
               </w:rPr>
-              <w:t>宏观通胀传导</w:t>
+              <w:t>AI 基础设施</w:t>
             </w:r>
           </w:p>
         </w:tc>
@@ -1599,12 +1599,12 @@
             <w:r/>
             <w:r>
               <w:rPr>
-                <w:rFonts w:ascii="Calibri" w:hAnsi="Calibri" w:eastAsia="Heiti TC"/>
+                <w:rFonts w:ascii="Calibri" w:hAnsi="Calibri" w:eastAsia="Arial Unicode MS"/>
                 <w:b/>
                 <w:color w:val="111827"/>
                 <w:sz w:val="17"/>
               </w:rPr>
-              <w:t>45.1</w:t>
+              <w:t>46.9</w:t>
             </w:r>
           </w:p>
         </w:tc>
@@ -1621,7 +1621,7 @@
             <w:r/>
             <w:r>
               <w:rPr>
-                <w:rFonts w:ascii="Calibri" w:hAnsi="Calibri" w:eastAsia="Heiti TC"/>
+                <w:rFonts w:ascii="Calibri" w:hAnsi="Calibri" w:eastAsia="Arial Unicode MS"/>
                 <w:b w:val="0"/>
                 <w:color w:val="111827"/>
                 <w:sz w:val="16"/>
@@ -1644,7 +1644,116 @@
             <w:r/>
             <w:r>
               <w:rPr>
-                <w:rFonts w:ascii="Calibri" w:hAnsi="Calibri" w:eastAsia="Heiti TC"/>
+                <w:rFonts w:ascii="Calibri" w:hAnsi="Calibri" w:eastAsia="Arial Unicode MS"/>
+                <w:b w:val="0"/>
+                <w:color w:val="111827"/>
+                <w:sz w:val="17"/>
+              </w:rPr>
+              <w:t>自备电源只是把 time-to-power 瓶颈搬家，并没有消除它</w:t>
+            </w:r>
+          </w:p>
+        </w:tc>
+        <w:tc>
+          <w:tcPr>
+            <w:tcW w:type="dxa" w:w="1560"/>
+            <w:vAlign w:val="center"/>
+          </w:tcPr>
+          <w:p>
+            <w:pPr>
+              <w:spacing w:before="0" w:after="0"/>
+            </w:pPr>
+            <w:r/>
+            <w:r>
+              <w:rPr>
+                <w:rFonts w:ascii="Calibri" w:hAnsi="Calibri" w:eastAsia="Arial Unicode MS"/>
+                <w:b w:val="0"/>
+                <w:color w:val="111827"/>
+                <w:sz w:val="16"/>
+              </w:rPr>
+              <w:t>未识别</w:t>
+            </w:r>
+          </w:p>
+        </w:tc>
+        <w:tc>
+          <w:tcPr>
+            <w:tcW w:type="dxa" w:w="1680"/>
+            <w:vAlign w:val="center"/>
+          </w:tcPr>
+          <w:p>
+            <w:pPr>
+              <w:spacing w:before="0" w:after="0"/>
+            </w:pPr>
+            <w:r/>
+            <w:r>
+              <w:rPr>
+                <w:rFonts w:ascii="Calibri" w:hAnsi="Calibri" w:eastAsia="Arial Unicode MS"/>
+                <w:b w:val="0"/>
+                <w:color w:val="111827"/>
+                <w:sz w:val="16"/>
+              </w:rPr>
+              <w:t>宏观通胀传导</w:t>
+            </w:r>
+          </w:p>
+        </w:tc>
+        <w:tc>
+          <w:tcPr>
+            <w:tcW w:type="dxa" w:w="900"/>
+            <w:vAlign w:val="center"/>
+          </w:tcPr>
+          <w:p>
+            <w:pPr>
+              <w:spacing w:before="0" w:after="0"/>
+              <w:jc w:val="center"/>
+            </w:pPr>
+            <w:r/>
+            <w:r>
+              <w:rPr>
+                <w:rFonts w:ascii="Calibri" w:hAnsi="Calibri" w:eastAsia="Arial Unicode MS"/>
+                <w:b/>
+                <w:color w:val="111827"/>
+                <w:sz w:val="17"/>
+              </w:rPr>
+              <w:t>45.1</w:t>
+            </w:r>
+          </w:p>
+        </w:tc>
+        <w:tc>
+          <w:tcPr>
+            <w:tcW w:type="dxa" w:w="1500"/>
+            <w:vAlign w:val="center"/>
+          </w:tcPr>
+          <w:p>
+            <w:pPr>
+              <w:spacing w:before="0" w:after="0"/>
+              <w:jc w:val="center"/>
+            </w:pPr>
+            <w:r/>
+            <w:r>
+              <w:rPr>
+                <w:rFonts w:ascii="Calibri" w:hAnsi="Calibri" w:eastAsia="Arial Unicode MS"/>
+                <w:b w:val="0"/>
+                <w:color w:val="111827"/>
+                <w:sz w:val="16"/>
+              </w:rPr>
+              <w:t>风险 2</w:t>
+            </w:r>
+          </w:p>
+        </w:tc>
+      </w:tr>
+      <w:tr>
+        <w:tc>
+          <w:tcPr>
+            <w:tcW w:type="dxa" w:w="3720"/>
+            <w:vAlign w:val="center"/>
+          </w:tcPr>
+          <w:p>
+            <w:pPr>
+              <w:spacing w:before="0" w:after="0"/>
+            </w:pPr>
+            <w:r/>
+            <w:r>
+              <w:rPr>
+                <w:rFonts w:ascii="Calibri" w:hAnsi="Calibri" w:eastAsia="Arial Unicode MS"/>
                 <w:b w:val="0"/>
                 <w:color w:val="111827"/>
                 <w:sz w:val="17"/>
@@ -1665,7 +1774,7 @@
             <w:r/>
             <w:r>
               <w:rPr>
-                <w:rFonts w:ascii="Calibri" w:hAnsi="Calibri" w:eastAsia="Heiti TC"/>
+                <w:rFonts w:ascii="Calibri" w:hAnsi="Calibri" w:eastAsia="Arial Unicode MS"/>
                 <w:b w:val="0"/>
                 <w:color w:val="111827"/>
                 <w:sz w:val="16"/>
@@ -1686,7 +1795,7 @@
             <w:r/>
             <w:r>
               <w:rPr>
-                <w:rFonts w:ascii="Calibri" w:hAnsi="Calibri" w:eastAsia="Heiti TC"/>
+                <w:rFonts w:ascii="Calibri" w:hAnsi="Calibri" w:eastAsia="Arial Unicode MS"/>
                 <w:b w:val="0"/>
                 <w:color w:val="111827"/>
                 <w:sz w:val="16"/>
@@ -1708,7 +1817,7 @@
             <w:r/>
             <w:r>
               <w:rPr>
-                <w:rFonts w:ascii="Calibri" w:hAnsi="Calibri" w:eastAsia="Heiti TC"/>
+                <w:rFonts w:ascii="Calibri" w:hAnsi="Calibri" w:eastAsia="Arial Unicode MS"/>
                 <w:b/>
                 <w:color w:val="111827"/>
                 <w:sz w:val="17"/>
@@ -1730,7 +1839,7 @@
             <w:r/>
             <w:r>
               <w:rPr>
-                <w:rFonts w:ascii="Calibri" w:hAnsi="Calibri" w:eastAsia="Heiti TC"/>
+                <w:rFonts w:ascii="Calibri" w:hAnsi="Calibri" w:eastAsia="Arial Unicode MS"/>
                 <w:b w:val="0"/>
                 <w:color w:val="111827"/>
                 <w:sz w:val="16"/>
@@ -1753,7 +1862,7 @@
             <w:r/>
             <w:r>
               <w:rPr>
-                <w:rFonts w:ascii="Calibri" w:hAnsi="Calibri" w:eastAsia="Heiti TC"/>
+                <w:rFonts w:ascii="Calibri" w:hAnsi="Calibri" w:eastAsia="Arial Unicode MS"/>
                 <w:b w:val="0"/>
                 <w:color w:val="111827"/>
                 <w:sz w:val="17"/>
@@ -1774,7 +1883,7 @@
             <w:r/>
             <w:r>
               <w:rPr>
-                <w:rFonts w:ascii="Calibri" w:hAnsi="Calibri" w:eastAsia="Heiti TC"/>
+                <w:rFonts w:ascii="Calibri" w:hAnsi="Calibri" w:eastAsia="Arial Unicode MS"/>
                 <w:b w:val="0"/>
                 <w:color w:val="111827"/>
                 <w:sz w:val="16"/>
@@ -1795,7 +1904,7 @@
             <w:r/>
             <w:r>
               <w:rPr>
-                <w:rFonts w:ascii="Calibri" w:hAnsi="Calibri" w:eastAsia="Heiti TC"/>
+                <w:rFonts w:ascii="Calibri" w:hAnsi="Calibri" w:eastAsia="Arial Unicode MS"/>
                 <w:b w:val="0"/>
                 <w:color w:val="111827"/>
                 <w:sz w:val="16"/>
@@ -1817,7 +1926,7 @@
             <w:r/>
             <w:r>
               <w:rPr>
-                <w:rFonts w:ascii="Calibri" w:hAnsi="Calibri" w:eastAsia="Heiti TC"/>
+                <w:rFonts w:ascii="Calibri" w:hAnsi="Calibri" w:eastAsia="Arial Unicode MS"/>
                 <w:b/>
                 <w:color w:val="111827"/>
                 <w:sz w:val="17"/>
@@ -1839,7 +1948,7 @@
             <w:r/>
             <w:r>
               <w:rPr>
-                <w:rFonts w:ascii="Calibri" w:hAnsi="Calibri" w:eastAsia="Heiti TC"/>
+                <w:rFonts w:ascii="Calibri" w:hAnsi="Calibri" w:eastAsia="Arial Unicode MS"/>
                 <w:b w:val="0"/>
                 <w:color w:val="111827"/>
                 <w:sz w:val="16"/>
@@ -1862,7 +1971,7 @@
             <w:r/>
             <w:r>
               <w:rPr>
-                <w:rFonts w:ascii="Calibri" w:hAnsi="Calibri" w:eastAsia="Heiti TC"/>
+                <w:rFonts w:ascii="Calibri" w:hAnsi="Calibri" w:eastAsia="Arial Unicode MS"/>
                 <w:b w:val="0"/>
                 <w:color w:val="111827"/>
                 <w:sz w:val="17"/>
@@ -1883,7 +1992,7 @@
             <w:r/>
             <w:r>
               <w:rPr>
-                <w:rFonts w:ascii="Calibri" w:hAnsi="Calibri" w:eastAsia="Heiti TC"/>
+                <w:rFonts w:ascii="Calibri" w:hAnsi="Calibri" w:eastAsia="Arial Unicode MS"/>
                 <w:b w:val="0"/>
                 <w:color w:val="111827"/>
                 <w:sz w:val="16"/>
@@ -1904,7 +2013,7 @@
             <w:r/>
             <w:r>
               <w:rPr>
-                <w:rFonts w:ascii="Calibri" w:hAnsi="Calibri" w:eastAsia="Heiti TC"/>
+                <w:rFonts w:ascii="Calibri" w:hAnsi="Calibri" w:eastAsia="Arial Unicode MS"/>
                 <w:b w:val="0"/>
                 <w:color w:val="111827"/>
                 <w:sz w:val="16"/>
@@ -1926,7 +2035,7 @@
             <w:r/>
             <w:r>
               <w:rPr>
-                <w:rFonts w:ascii="Calibri" w:hAnsi="Calibri" w:eastAsia="Heiti TC"/>
+                <w:rFonts w:ascii="Calibri" w:hAnsi="Calibri" w:eastAsia="Arial Unicode MS"/>
                 <w:b/>
                 <w:color w:val="111827"/>
                 <w:sz w:val="17"/>
@@ -1948,7 +2057,7 @@
             <w:r/>
             <w:r>
               <w:rPr>
-                <w:rFonts w:ascii="Calibri" w:hAnsi="Calibri" w:eastAsia="Heiti TC"/>
+                <w:rFonts w:ascii="Calibri" w:hAnsi="Calibri" w:eastAsia="Arial Unicode MS"/>
                 <w:b w:val="0"/>
                 <w:color w:val="111827"/>
                 <w:sz w:val="16"/>
@@ -1971,7 +2080,7 @@
             <w:r/>
             <w:r>
               <w:rPr>
-                <w:rFonts w:ascii="Calibri" w:hAnsi="Calibri" w:eastAsia="Heiti TC"/>
+                <w:rFonts w:ascii="Calibri" w:hAnsi="Calibri" w:eastAsia="Arial Unicode MS"/>
                 <w:b w:val="0"/>
                 <w:color w:val="111827"/>
                 <w:sz w:val="17"/>
@@ -1992,7 +2101,7 @@
             <w:r/>
             <w:r>
               <w:rPr>
-                <w:rFonts w:ascii="Calibri" w:hAnsi="Calibri" w:eastAsia="Heiti TC"/>
+                <w:rFonts w:ascii="Calibri" w:hAnsi="Calibri" w:eastAsia="Arial Unicode MS"/>
                 <w:b w:val="0"/>
                 <w:color w:val="111827"/>
                 <w:sz w:val="16"/>
@@ -2013,7 +2122,7 @@
             <w:r/>
             <w:r>
               <w:rPr>
-                <w:rFonts w:ascii="Calibri" w:hAnsi="Calibri" w:eastAsia="Heiti TC"/>
+                <w:rFonts w:ascii="Calibri" w:hAnsi="Calibri" w:eastAsia="Arial Unicode MS"/>
                 <w:b w:val="0"/>
                 <w:color w:val="111827"/>
                 <w:sz w:val="16"/>
@@ -2035,7 +2144,7 @@
             <w:r/>
             <w:r>
               <w:rPr>
-                <w:rFonts w:ascii="Calibri" w:hAnsi="Calibri" w:eastAsia="Heiti TC"/>
+                <w:rFonts w:ascii="Calibri" w:hAnsi="Calibri" w:eastAsia="Arial Unicode MS"/>
                 <w:b/>
                 <w:color w:val="111827"/>
                 <w:sz w:val="17"/>
@@ -2057,7 +2166,7 @@
             <w:r/>
             <w:r>
               <w:rPr>
-                <w:rFonts w:ascii="Calibri" w:hAnsi="Calibri" w:eastAsia="Heiti TC"/>
+                <w:rFonts w:ascii="Calibri" w:hAnsi="Calibri" w:eastAsia="Arial Unicode MS"/>
                 <w:b w:val="0"/>
                 <w:color w:val="111827"/>
                 <w:sz w:val="16"/>
@@ -2080,7 +2189,7 @@
             <w:r/>
             <w:r>
               <w:rPr>
-                <w:rFonts w:ascii="Calibri" w:hAnsi="Calibri" w:eastAsia="Heiti TC"/>
+                <w:rFonts w:ascii="Calibri" w:hAnsi="Calibri" w:eastAsia="Arial Unicode MS"/>
                 <w:b w:val="0"/>
                 <w:color w:val="111827"/>
                 <w:sz w:val="17"/>
@@ -2101,7 +2210,7 @@
             <w:r/>
             <w:r>
               <w:rPr>
-                <w:rFonts w:ascii="Calibri" w:hAnsi="Calibri" w:eastAsia="Heiti TC"/>
+                <w:rFonts w:ascii="Calibri" w:hAnsi="Calibri" w:eastAsia="Arial Unicode MS"/>
                 <w:b w:val="0"/>
                 <w:color w:val="111827"/>
                 <w:sz w:val="16"/>
@@ -2122,7 +2231,7 @@
             <w:r/>
             <w:r>
               <w:rPr>
-                <w:rFonts w:ascii="Calibri" w:hAnsi="Calibri" w:eastAsia="Heiti TC"/>
+                <w:rFonts w:ascii="Calibri" w:hAnsi="Calibri" w:eastAsia="Arial Unicode MS"/>
                 <w:b w:val="0"/>
                 <w:color w:val="111827"/>
                 <w:sz w:val="16"/>
@@ -2144,7 +2253,7 @@
             <w:r/>
             <w:r>
               <w:rPr>
-                <w:rFonts w:ascii="Calibri" w:hAnsi="Calibri" w:eastAsia="Heiti TC"/>
+                <w:rFonts w:ascii="Calibri" w:hAnsi="Calibri" w:eastAsia="Arial Unicode MS"/>
                 <w:b/>
                 <w:color w:val="111827"/>
                 <w:sz w:val="17"/>
@@ -2166,7 +2275,7 @@
             <w:r/>
             <w:r>
               <w:rPr>
-                <w:rFonts w:ascii="Calibri" w:hAnsi="Calibri" w:eastAsia="Heiti TC"/>
+                <w:rFonts w:ascii="Calibri" w:hAnsi="Calibri" w:eastAsia="Arial Unicode MS"/>
                 <w:b w:val="0"/>
                 <w:color w:val="111827"/>
                 <w:sz w:val="16"/>
@@ -2189,12 +2298,12 @@
             <w:r/>
             <w:r>
               <w:rPr>
-                <w:rFonts w:ascii="Calibri" w:hAnsi="Calibri" w:eastAsia="Heiti TC"/>
+                <w:rFonts w:ascii="Calibri" w:hAnsi="Calibri" w:eastAsia="Arial Unicode MS"/>
                 <w:b w:val="0"/>
                 <w:color w:val="111827"/>
                 <w:sz w:val="17"/>
               </w:rPr>
-              <w:t>压力测试13%火电灵活性仓位：容量电价、辅助服务、煤价传导，还是迁往受监管公用事业/高股息防御？</w:t>
+              <w:t>能源冲击、美元走强与亚洲央行的政策边界</w:t>
             </w:r>
           </w:p>
         </w:tc>
@@ -2210,7 +2319,7 @@
             <w:r/>
             <w:r>
               <w:rPr>
-                <w:rFonts w:ascii="Calibri" w:hAnsi="Calibri" w:eastAsia="Heiti TC"/>
+                <w:rFonts w:ascii="Calibri" w:hAnsi="Calibri" w:eastAsia="Arial Unicode MS"/>
                 <w:b w:val="0"/>
                 <w:color w:val="111827"/>
                 <w:sz w:val="16"/>
@@ -2231,7 +2340,7 @@
             <w:r/>
             <w:r>
               <w:rPr>
-                <w:rFonts w:ascii="Calibri" w:hAnsi="Calibri" w:eastAsia="Heiti TC"/>
+                <w:rFonts w:ascii="Calibri" w:hAnsi="Calibri" w:eastAsia="Arial Unicode MS"/>
                 <w:b w:val="0"/>
                 <w:color w:val="111827"/>
                 <w:sz w:val="16"/>
@@ -2253,7 +2362,116 @@
             <w:r/>
             <w:r>
               <w:rPr>
-                <w:rFonts w:ascii="Calibri" w:hAnsi="Calibri" w:eastAsia="Heiti TC"/>
+                <w:rFonts w:ascii="Calibri" w:hAnsi="Calibri" w:eastAsia="Arial Unicode MS"/>
+                <w:b/>
+                <w:color w:val="111827"/>
+                <w:sz w:val="17"/>
+              </w:rPr>
+              <w:t>42.8</w:t>
+            </w:r>
+          </w:p>
+        </w:tc>
+        <w:tc>
+          <w:tcPr>
+            <w:tcW w:type="dxa" w:w="1500"/>
+            <w:vAlign w:val="center"/>
+          </w:tcPr>
+          <w:p>
+            <w:pPr>
+              <w:spacing w:before="0" w:after="0"/>
+              <w:jc w:val="center"/>
+            </w:pPr>
+            <w:r/>
+            <w:r>
+              <w:rPr>
+                <w:rFonts w:ascii="Calibri" w:hAnsi="Calibri" w:eastAsia="Arial Unicode MS"/>
+                <w:b w:val="0"/>
+                <w:color w:val="111827"/>
+                <w:sz w:val="16"/>
+              </w:rPr>
+              <w:t>常规</w:t>
+            </w:r>
+          </w:p>
+        </w:tc>
+      </w:tr>
+      <w:tr>
+        <w:tc>
+          <w:tcPr>
+            <w:tcW w:type="dxa" w:w="3720"/>
+            <w:vAlign w:val="center"/>
+          </w:tcPr>
+          <w:p>
+            <w:pPr>
+              <w:spacing w:before="0" w:after="0"/>
+            </w:pPr>
+            <w:r/>
+            <w:r>
+              <w:rPr>
+                <w:rFonts w:ascii="Calibri" w:hAnsi="Calibri" w:eastAsia="Arial Unicode MS"/>
+                <w:b w:val="0"/>
+                <w:color w:val="111827"/>
+                <w:sz w:val="17"/>
+              </w:rPr>
+              <w:t>压力测试13%火电灵活性仓位：容量电价、辅助服务、煤价传导，还是迁往受监管公用事业/高股息防御？</w:t>
+            </w:r>
+          </w:p>
+        </w:tc>
+        <w:tc>
+          <w:tcPr>
+            <w:tcW w:type="dxa" w:w="1560"/>
+            <w:vAlign w:val="center"/>
+          </w:tcPr>
+          <w:p>
+            <w:pPr>
+              <w:spacing w:before="0" w:after="0"/>
+            </w:pPr>
+            <w:r/>
+            <w:r>
+              <w:rPr>
+                <w:rFonts w:ascii="Calibri" w:hAnsi="Calibri" w:eastAsia="Arial Unicode MS"/>
+                <w:b w:val="0"/>
+                <w:color w:val="111827"/>
+                <w:sz w:val="16"/>
+              </w:rPr>
+              <w:t>未识别</w:t>
+            </w:r>
+          </w:p>
+        </w:tc>
+        <w:tc>
+          <w:tcPr>
+            <w:tcW w:type="dxa" w:w="1680"/>
+            <w:vAlign w:val="center"/>
+          </w:tcPr>
+          <w:p>
+            <w:pPr>
+              <w:spacing w:before="0" w:after="0"/>
+            </w:pPr>
+            <w:r/>
+            <w:r>
+              <w:rPr>
+                <w:rFonts w:ascii="Calibri" w:hAnsi="Calibri" w:eastAsia="Arial Unicode MS"/>
+                <w:b w:val="0"/>
+                <w:color w:val="111827"/>
+                <w:sz w:val="16"/>
+              </w:rPr>
+              <w:t>宏观通胀传导</w:t>
+            </w:r>
+          </w:p>
+        </w:tc>
+        <w:tc>
+          <w:tcPr>
+            <w:tcW w:type="dxa" w:w="900"/>
+            <w:vAlign w:val="center"/>
+          </w:tcPr>
+          <w:p>
+            <w:pPr>
+              <w:spacing w:before="0" w:after="0"/>
+              <w:jc w:val="center"/>
+            </w:pPr>
+            <w:r/>
+            <w:r>
+              <w:rPr>
+                <w:rFonts w:ascii="Calibri" w:hAnsi="Calibri" w:eastAsia="Arial Unicode MS"/>
                 <w:b/>
                 <w:color w:val="111827"/>
                 <w:sz w:val="17"/>
@@ -2275,7 +2493,7 @@
             <w:r/>
             <w:r>
               <w:rPr>
-                <w:rFonts w:ascii="Calibri" w:hAnsi="Calibri" w:eastAsia="Heiti TC"/>
+                <w:rFonts w:ascii="Calibri" w:hAnsi="Calibri" w:eastAsia="Arial Unicode MS"/>
                 <w:b w:val="0"/>
                 <w:color w:val="111827"/>
                 <w:sz w:val="16"/>
@@ -2298,12 +2516,12 @@
             <w:r/>
             <w:r>
               <w:rPr>
-                <w:rFonts w:ascii="Calibri" w:hAnsi="Calibri" w:eastAsia="Heiti TC"/>
+                <w:rFonts w:ascii="Calibri" w:hAnsi="Calibri" w:eastAsia="Arial Unicode MS"/>
                 <w:b w:val="0"/>
                 <w:color w:val="111827"/>
                 <w:sz w:val="17"/>
               </w:rPr>
-              <w:t>2026-07-18：维持20% AI电力封顶下的A股再平衡规则</w:t>
+              <w:t>AI硬件卖压外溢至亚洲半导体开盘 — 2026-07-18</w:t>
             </w:r>
           </w:p>
         </w:tc>
@@ -2319,7 +2537,7 @@
             <w:r/>
             <w:r>
               <w:rPr>
-                <w:rFonts w:ascii="Calibri" w:hAnsi="Calibri" w:eastAsia="Heiti TC"/>
+                <w:rFonts w:ascii="Calibri" w:hAnsi="Calibri" w:eastAsia="Arial Unicode MS"/>
                 <w:b w:val="0"/>
                 <w:color w:val="111827"/>
                 <w:sz w:val="16"/>
@@ -2340,7 +2558,7 @@
             <w:r/>
             <w:r>
               <w:rPr>
-                <w:rFonts w:ascii="Calibri" w:hAnsi="Calibri" w:eastAsia="Heiti TC"/>
+                <w:rFonts w:ascii="Calibri" w:hAnsi="Calibri" w:eastAsia="Arial Unicode MS"/>
                 <w:b w:val="0"/>
                 <w:color w:val="111827"/>
                 <w:sz w:val="16"/>
@@ -2362,7 +2580,116 @@
             <w:r/>
             <w:r>
               <w:rPr>
-                <w:rFonts w:ascii="Calibri" w:hAnsi="Calibri" w:eastAsia="Heiti TC"/>
+                <w:rFonts w:ascii="Calibri" w:hAnsi="Calibri" w:eastAsia="Arial Unicode MS"/>
+                <w:b/>
+                <w:color w:val="111827"/>
+                <w:sz w:val="17"/>
+              </w:rPr>
+              <w:t>42.2</w:t>
+            </w:r>
+          </w:p>
+        </w:tc>
+        <w:tc>
+          <w:tcPr>
+            <w:tcW w:type="dxa" w:w="1500"/>
+            <w:vAlign w:val="center"/>
+          </w:tcPr>
+          <w:p>
+            <w:pPr>
+              <w:spacing w:before="0" w:after="0"/>
+              <w:jc w:val="center"/>
+            </w:pPr>
+            <w:r/>
+            <w:r>
+              <w:rPr>
+                <w:rFonts w:ascii="Calibri" w:hAnsi="Calibri" w:eastAsia="Arial Unicode MS"/>
+                <w:b w:val="0"/>
+                <w:color w:val="111827"/>
+                <w:sz w:val="16"/>
+              </w:rPr>
+              <w:t>风险 1</w:t>
+            </w:r>
+          </w:p>
+        </w:tc>
+      </w:tr>
+      <w:tr>
+        <w:tc>
+          <w:tcPr>
+            <w:tcW w:type="dxa" w:w="3720"/>
+            <w:vAlign w:val="center"/>
+          </w:tcPr>
+          <w:p>
+            <w:pPr>
+              <w:spacing w:before="0" w:after="0"/>
+            </w:pPr>
+            <w:r/>
+            <w:r>
+              <w:rPr>
+                <w:rFonts w:ascii="Calibri" w:hAnsi="Calibri" w:eastAsia="Arial Unicode MS"/>
+                <w:b w:val="0"/>
+                <w:color w:val="111827"/>
+                <w:sz w:val="17"/>
+              </w:rPr>
+              <w:t>2026-07-18：维持20% AI电力封顶下的A股再平衡规则</w:t>
+            </w:r>
+          </w:p>
+        </w:tc>
+        <w:tc>
+          <w:tcPr>
+            <w:tcW w:type="dxa" w:w="1560"/>
+            <w:vAlign w:val="center"/>
+          </w:tcPr>
+          <w:p>
+            <w:pPr>
+              <w:spacing w:before="0" w:after="0"/>
+            </w:pPr>
+            <w:r/>
+            <w:r>
+              <w:rPr>
+                <w:rFonts w:ascii="Calibri" w:hAnsi="Calibri" w:eastAsia="Arial Unicode MS"/>
+                <w:b w:val="0"/>
+                <w:color w:val="111827"/>
+                <w:sz w:val="16"/>
+              </w:rPr>
+              <w:t>未识别</w:t>
+            </w:r>
+          </w:p>
+        </w:tc>
+        <w:tc>
+          <w:tcPr>
+            <w:tcW w:type="dxa" w:w="1680"/>
+            <w:vAlign w:val="center"/>
+          </w:tcPr>
+          <w:p>
+            <w:pPr>
+              <w:spacing w:before="0" w:after="0"/>
+            </w:pPr>
+            <w:r/>
+            <w:r>
+              <w:rPr>
+                <w:rFonts w:ascii="Calibri" w:hAnsi="Calibri" w:eastAsia="Arial Unicode MS"/>
+                <w:b w:val="0"/>
+                <w:color w:val="111827"/>
+                <w:sz w:val="16"/>
+              </w:rPr>
+              <w:t>宏观通胀传导</w:t>
+            </w:r>
+          </w:p>
+        </w:tc>
+        <w:tc>
+          <w:tcPr>
+            <w:tcW w:type="dxa" w:w="900"/>
+            <w:vAlign w:val="center"/>
+          </w:tcPr>
+          <w:p>
+            <w:pPr>
+              <w:spacing w:before="0" w:after="0"/>
+              <w:jc w:val="center"/>
+            </w:pPr>
+            <w:r/>
+            <w:r>
+              <w:rPr>
+                <w:rFonts w:ascii="Calibri" w:hAnsi="Calibri" w:eastAsia="Arial Unicode MS"/>
                 <w:b/>
                 <w:color w:val="111827"/>
                 <w:sz w:val="17"/>
@@ -2384,7 +2711,7 @@
             <w:r/>
             <w:r>
               <w:rPr>
-                <w:rFonts w:ascii="Calibri" w:hAnsi="Calibri" w:eastAsia="Heiti TC"/>
+                <w:rFonts w:ascii="Calibri" w:hAnsi="Calibri" w:eastAsia="Arial Unicode MS"/>
                 <w:b w:val="0"/>
                 <w:color w:val="111827"/>
                 <w:sz w:val="16"/>
@@ -2407,7 +2734,116 @@
             <w:r/>
             <w:r>
               <w:rPr>
-                <w:rFonts w:ascii="Calibri" w:hAnsi="Calibri" w:eastAsia="Heiti TC"/>
+                <w:rFonts w:ascii="Calibri" w:hAnsi="Calibri" w:eastAsia="Arial Unicode MS"/>
+                <w:b w:val="0"/>
+                <w:color w:val="111827"/>
+                <w:sz w:val="17"/>
+              </w:rPr>
+              <w:t>外汇防御与两融去杠杆共振下的A股防线排序</w:t>
+            </w:r>
+          </w:p>
+        </w:tc>
+        <w:tc>
+          <w:tcPr>
+            <w:tcW w:type="dxa" w:w="1560"/>
+            <w:vAlign w:val="center"/>
+          </w:tcPr>
+          <w:p>
+            <w:pPr>
+              <w:spacing w:before="0" w:after="0"/>
+            </w:pPr>
+            <w:r/>
+            <w:r>
+              <w:rPr>
+                <w:rFonts w:ascii="Calibri" w:hAnsi="Calibri" w:eastAsia="Arial Unicode MS"/>
+                <w:b w:val="0"/>
+                <w:color w:val="111827"/>
+                <w:sz w:val="16"/>
+              </w:rPr>
+              <w:t>未识别</w:t>
+            </w:r>
+          </w:p>
+        </w:tc>
+        <w:tc>
+          <w:tcPr>
+            <w:tcW w:type="dxa" w:w="1680"/>
+            <w:vAlign w:val="center"/>
+          </w:tcPr>
+          <w:p>
+            <w:pPr>
+              <w:spacing w:before="0" w:after="0"/>
+            </w:pPr>
+            <w:r/>
+            <w:r>
+              <w:rPr>
+                <w:rFonts w:ascii="Calibri" w:hAnsi="Calibri" w:eastAsia="Arial Unicode MS"/>
+                <w:b w:val="0"/>
+                <w:color w:val="111827"/>
+                <w:sz w:val="16"/>
+              </w:rPr>
+              <w:t>宏观通胀传导</w:t>
+            </w:r>
+          </w:p>
+        </w:tc>
+        <w:tc>
+          <w:tcPr>
+            <w:tcW w:type="dxa" w:w="900"/>
+            <w:vAlign w:val="center"/>
+          </w:tcPr>
+          <w:p>
+            <w:pPr>
+              <w:spacing w:before="0" w:after="0"/>
+              <w:jc w:val="center"/>
+            </w:pPr>
+            <w:r/>
+            <w:r>
+              <w:rPr>
+                <w:rFonts w:ascii="Calibri" w:hAnsi="Calibri" w:eastAsia="Arial Unicode MS"/>
+                <w:b/>
+                <w:color w:val="111827"/>
+                <w:sz w:val="17"/>
+              </w:rPr>
+              <w:t>41.7</w:t>
+            </w:r>
+          </w:p>
+        </w:tc>
+        <w:tc>
+          <w:tcPr>
+            <w:tcW w:type="dxa" w:w="1500"/>
+            <w:vAlign w:val="center"/>
+          </w:tcPr>
+          <w:p>
+            <w:pPr>
+              <w:spacing w:before="0" w:after="0"/>
+              <w:jc w:val="center"/>
+            </w:pPr>
+            <w:r/>
+            <w:r>
+              <w:rPr>
+                <w:rFonts w:ascii="Calibri" w:hAnsi="Calibri" w:eastAsia="Arial Unicode MS"/>
+                <w:b w:val="0"/>
+                <w:color w:val="111827"/>
+                <w:sz w:val="16"/>
+              </w:rPr>
+              <w:t>风险 1</w:t>
+            </w:r>
+          </w:p>
+        </w:tc>
+      </w:tr>
+      <w:tr>
+        <w:tc>
+          <w:tcPr>
+            <w:tcW w:type="dxa" w:w="3720"/>
+            <w:vAlign w:val="center"/>
+          </w:tcPr>
+          <w:p>
+            <w:pPr>
+              <w:spacing w:before="0" w:after="0"/>
+            </w:pPr>
+            <w:r/>
+            <w:r>
+              <w:rPr>
+                <w:rFonts w:ascii="Calibri" w:hAnsi="Calibri" w:eastAsia="Arial Unicode MS"/>
                 <w:b w:val="0"/>
                 <w:color w:val="111827"/>
                 <w:sz w:val="17"/>
@@ -2428,7 +2864,7 @@
             <w:r/>
             <w:r>
               <w:rPr>
-                <w:rFonts w:ascii="Calibri" w:hAnsi="Calibri" w:eastAsia="Heiti TC"/>
+                <w:rFonts w:ascii="Calibri" w:hAnsi="Calibri" w:eastAsia="Arial Unicode MS"/>
                 <w:b w:val="0"/>
                 <w:color w:val="111827"/>
                 <w:sz w:val="16"/>
@@ -2449,7 +2885,7 @@
             <w:r/>
             <w:r>
               <w:rPr>
-                <w:rFonts w:ascii="Calibri" w:hAnsi="Calibri" w:eastAsia="Heiti TC"/>
+                <w:rFonts w:ascii="Calibri" w:hAnsi="Calibri" w:eastAsia="Arial Unicode MS"/>
                 <w:b w:val="0"/>
                 <w:color w:val="111827"/>
                 <w:sz w:val="16"/>
@@ -2471,7 +2907,7 @@
             <w:r/>
             <w:r>
               <w:rPr>
-                <w:rFonts w:ascii="Calibri" w:hAnsi="Calibri" w:eastAsia="Heiti TC"/>
+                <w:rFonts w:ascii="Calibri" w:hAnsi="Calibri" w:eastAsia="Arial Unicode MS"/>
                 <w:b/>
                 <w:color w:val="111827"/>
                 <w:sz w:val="17"/>
@@ -2493,7 +2929,7 @@
             <w:r/>
             <w:r>
               <w:rPr>
-                <w:rFonts w:ascii="Calibri" w:hAnsi="Calibri" w:eastAsia="Heiti TC"/>
+                <w:rFonts w:ascii="Calibri" w:hAnsi="Calibri" w:eastAsia="Arial Unicode MS"/>
                 <w:b w:val="0"/>
                 <w:color w:val="111827"/>
                 <w:sz w:val="16"/>
@@ -2516,7 +2952,7 @@
             <w:r/>
             <w:r>
               <w:rPr>
-                <w:rFonts w:ascii="Calibri" w:hAnsi="Calibri" w:eastAsia="Heiti TC"/>
+                <w:rFonts w:ascii="Calibri" w:hAnsi="Calibri" w:eastAsia="Arial Unicode MS"/>
                 <w:b w:val="0"/>
                 <w:color w:val="111827"/>
                 <w:sz w:val="17"/>
@@ -2537,7 +2973,7 @@
             <w:r/>
             <w:r>
               <w:rPr>
-                <w:rFonts w:ascii="Calibri" w:hAnsi="Calibri" w:eastAsia="Heiti TC"/>
+                <w:rFonts w:ascii="Calibri" w:hAnsi="Calibri" w:eastAsia="Arial Unicode MS"/>
                 <w:b w:val="0"/>
                 <w:color w:val="111827"/>
                 <w:sz w:val="16"/>
@@ -2558,7 +2994,7 @@
             <w:r/>
             <w:r>
               <w:rPr>
-                <w:rFonts w:ascii="Calibri" w:hAnsi="Calibri" w:eastAsia="Heiti TC"/>
+                <w:rFonts w:ascii="Calibri" w:hAnsi="Calibri" w:eastAsia="Arial Unicode MS"/>
                 <w:b w:val="0"/>
                 <w:color w:val="111827"/>
                 <w:sz w:val="16"/>
@@ -2580,7 +3016,7 @@
             <w:r/>
             <w:r>
               <w:rPr>
-                <w:rFonts w:ascii="Calibri" w:hAnsi="Calibri" w:eastAsia="Heiti TC"/>
+                <w:rFonts w:ascii="Calibri" w:hAnsi="Calibri" w:eastAsia="Arial Unicode MS"/>
                 <w:b/>
                 <w:color w:val="111827"/>
                 <w:sz w:val="17"/>
@@ -2602,7 +3038,7 @@
             <w:r/>
             <w:r>
               <w:rPr>
-                <w:rFonts w:ascii="Calibri" w:hAnsi="Calibri" w:eastAsia="Heiti TC"/>
+                <w:rFonts w:ascii="Calibri" w:hAnsi="Calibri" w:eastAsia="Arial Unicode MS"/>
                 <w:b w:val="0"/>
                 <w:color w:val="111827"/>
                 <w:sz w:val="16"/>
@@ -2625,7 +3061,7 @@
             <w:r/>
             <w:r>
               <w:rPr>
-                <w:rFonts w:ascii="Calibri" w:hAnsi="Calibri" w:eastAsia="Heiti TC"/>
+                <w:rFonts w:ascii="Calibri" w:hAnsi="Calibri" w:eastAsia="Arial Unicode MS"/>
                 <w:b w:val="0"/>
                 <w:color w:val="111827"/>
                 <w:sz w:val="17"/>
@@ -2646,7 +3082,7 @@
             <w:r/>
             <w:r>
               <w:rPr>
-                <w:rFonts w:ascii="Calibri" w:hAnsi="Calibri" w:eastAsia="Heiti TC"/>
+                <w:rFonts w:ascii="Calibri" w:hAnsi="Calibri" w:eastAsia="Arial Unicode MS"/>
                 <w:b w:val="0"/>
                 <w:color w:val="111827"/>
                 <w:sz w:val="16"/>
@@ -2667,7 +3103,7 @@
             <w:r/>
             <w:r>
               <w:rPr>
-                <w:rFonts w:ascii="Calibri" w:hAnsi="Calibri" w:eastAsia="Heiti TC"/>
+                <w:rFonts w:ascii="Calibri" w:hAnsi="Calibri" w:eastAsia="Arial Unicode MS"/>
                 <w:b w:val="0"/>
                 <w:color w:val="111827"/>
                 <w:sz w:val="16"/>
@@ -2689,7 +3125,7 @@
             <w:r/>
             <w:r>
               <w:rPr>
-                <w:rFonts w:ascii="Calibri" w:hAnsi="Calibri" w:eastAsia="Heiti TC"/>
+                <w:rFonts w:ascii="Calibri" w:hAnsi="Calibri" w:eastAsia="Arial Unicode MS"/>
                 <w:b/>
                 <w:color w:val="111827"/>
                 <w:sz w:val="17"/>
@@ -2711,7 +3147,7 @@
             <w:r/>
             <w:r>
               <w:rPr>
-                <w:rFonts w:ascii="Calibri" w:hAnsi="Calibri" w:eastAsia="Heiti TC"/>
+                <w:rFonts w:ascii="Calibri" w:hAnsi="Calibri" w:eastAsia="Arial Unicode MS"/>
                 <w:b w:val="0"/>
                 <w:color w:val="111827"/>
                 <w:sz w:val="16"/>
@@ -2734,7 +3170,7 @@
             <w:r/>
             <w:r>
               <w:rPr>
-                <w:rFonts w:ascii="Calibri" w:hAnsi="Calibri" w:eastAsia="Heiti TC"/>
+                <w:rFonts w:ascii="Calibri" w:hAnsi="Calibri" w:eastAsia="Arial Unicode MS"/>
                 <w:b w:val="0"/>
                 <w:color w:val="111827"/>
                 <w:sz w:val="17"/>
@@ -2755,7 +3191,7 @@
             <w:r/>
             <w:r>
               <w:rPr>
-                <w:rFonts w:ascii="Calibri" w:hAnsi="Calibri" w:eastAsia="Heiti TC"/>
+                <w:rFonts w:ascii="Calibri" w:hAnsi="Calibri" w:eastAsia="Arial Unicode MS"/>
                 <w:b w:val="0"/>
                 <w:color w:val="111827"/>
                 <w:sz w:val="16"/>
@@ -2776,7 +3212,7 @@
             <w:r/>
             <w:r>
               <w:rPr>
-                <w:rFonts w:ascii="Calibri" w:hAnsi="Calibri" w:eastAsia="Heiti TC"/>
+                <w:rFonts w:ascii="Calibri" w:hAnsi="Calibri" w:eastAsia="Arial Unicode MS"/>
                 <w:b w:val="0"/>
                 <w:color w:val="111827"/>
                 <w:sz w:val="16"/>
@@ -2798,7 +3234,7 @@
             <w:r/>
             <w:r>
               <w:rPr>
-                <w:rFonts w:ascii="Calibri" w:hAnsi="Calibri" w:eastAsia="Heiti TC"/>
+                <w:rFonts w:ascii="Calibri" w:hAnsi="Calibri" w:eastAsia="Arial Unicode MS"/>
                 <w:b/>
                 <w:color w:val="111827"/>
                 <w:sz w:val="17"/>
@@ -2820,7 +3256,7 @@
             <w:r/>
             <w:r>
               <w:rPr>
-                <w:rFonts w:ascii="Calibri" w:hAnsi="Calibri" w:eastAsia="Heiti TC"/>
+                <w:rFonts w:ascii="Calibri" w:hAnsi="Calibri" w:eastAsia="Arial Unicode MS"/>
                 <w:b w:val="0"/>
                 <w:color w:val="111827"/>
                 <w:sz w:val="16"/>
@@ -2843,7 +3279,7 @@
             <w:r/>
             <w:r>
               <w:rPr>
-                <w:rFonts w:ascii="Calibri" w:hAnsi="Calibri" w:eastAsia="Heiti TC"/>
+                <w:rFonts w:ascii="Calibri" w:hAnsi="Calibri" w:eastAsia="Arial Unicode MS"/>
                 <w:b w:val="0"/>
                 <w:color w:val="111827"/>
                 <w:sz w:val="17"/>
@@ -2864,7 +3300,7 @@
             <w:r/>
             <w:r>
               <w:rPr>
-                <w:rFonts w:ascii="Calibri" w:hAnsi="Calibri" w:eastAsia="Heiti TC"/>
+                <w:rFonts w:ascii="Calibri" w:hAnsi="Calibri" w:eastAsia="Arial Unicode MS"/>
                 <w:b w:val="0"/>
                 <w:color w:val="111827"/>
                 <w:sz w:val="16"/>
@@ -2885,7 +3321,7 @@
             <w:r/>
             <w:r>
               <w:rPr>
-                <w:rFonts w:ascii="Calibri" w:hAnsi="Calibri" w:eastAsia="Heiti TC"/>
+                <w:rFonts w:ascii="Calibri" w:hAnsi="Calibri" w:eastAsia="Arial Unicode MS"/>
                 <w:b w:val="0"/>
                 <w:color w:val="111827"/>
                 <w:sz w:val="16"/>
@@ -2907,7 +3343,7 @@
             <w:r/>
             <w:r>
               <w:rPr>
-                <w:rFonts w:ascii="Calibri" w:hAnsi="Calibri" w:eastAsia="Heiti TC"/>
+                <w:rFonts w:ascii="Calibri" w:hAnsi="Calibri" w:eastAsia="Arial Unicode MS"/>
                 <w:b/>
                 <w:color w:val="111827"/>
                 <w:sz w:val="17"/>
@@ -2929,448 +3365,12 @@
             <w:r/>
             <w:r>
               <w:rPr>
-                <w:rFonts w:ascii="Calibri" w:hAnsi="Calibri" w:eastAsia="Heiti TC"/>
+                <w:rFonts w:ascii="Calibri" w:hAnsi="Calibri" w:eastAsia="Arial Unicode MS"/>
                 <w:b w:val="0"/>
                 <w:color w:val="111827"/>
                 <w:sz w:val="16"/>
               </w:rPr>
               <w:t>常规</w:t>
-            </w:r>
-          </w:p>
-        </w:tc>
-      </w:tr>
-      <w:tr>
-        <w:tc>
-          <w:tcPr>
-            <w:tcW w:type="dxa" w:w="3720"/>
-            <w:vAlign w:val="center"/>
-          </w:tcPr>
-          <w:p>
-            <w:pPr>
-              <w:spacing w:before="0" w:after="0"/>
-            </w:pPr>
-            <w:r/>
-            <w:r>
-              <w:rPr>
-                <w:rFonts w:ascii="Calibri" w:hAnsi="Calibri" w:eastAsia="Heiti TC"/>
-                <w:b w:val="0"/>
-                <w:color w:val="111827"/>
-                <w:sz w:val="17"/>
-              </w:rPr>
-              <w:t>从可融资储能收入堆栈到组合权重（工作日：2026-07-18）</w:t>
-            </w:r>
-          </w:p>
-        </w:tc>
-        <w:tc>
-          <w:tcPr>
-            <w:tcW w:type="dxa" w:w="1560"/>
-            <w:vAlign w:val="center"/>
-          </w:tcPr>
-          <w:p>
-            <w:pPr>
-              <w:spacing w:before="0" w:after="0"/>
-            </w:pPr>
-            <w:r/>
-            <w:r>
-              <w:rPr>
-                <w:rFonts w:ascii="Calibri" w:hAnsi="Calibri" w:eastAsia="Heiti TC"/>
-                <w:b w:val="0"/>
-                <w:color w:val="111827"/>
-                <w:sz w:val="16"/>
-              </w:rPr>
-              <w:t>未识别</w:t>
-            </w:r>
-          </w:p>
-        </w:tc>
-        <w:tc>
-          <w:tcPr>
-            <w:tcW w:type="dxa" w:w="1680"/>
-            <w:vAlign w:val="center"/>
-          </w:tcPr>
-          <w:p>
-            <w:pPr>
-              <w:spacing w:before="0" w:after="0"/>
-            </w:pPr>
-            <w:r/>
-            <w:r>
-              <w:rPr>
-                <w:rFonts w:ascii="Calibri" w:hAnsi="Calibri" w:eastAsia="Heiti TC"/>
-                <w:b w:val="0"/>
-                <w:color w:val="111827"/>
-                <w:sz w:val="16"/>
-              </w:rPr>
-              <w:t>宏观通胀传导</w:t>
-            </w:r>
-          </w:p>
-        </w:tc>
-        <w:tc>
-          <w:tcPr>
-            <w:tcW w:type="dxa" w:w="900"/>
-            <w:vAlign w:val="center"/>
-          </w:tcPr>
-          <w:p>
-            <w:pPr>
-              <w:spacing w:before="0" w:after="0"/>
-              <w:jc w:val="center"/>
-            </w:pPr>
-            <w:r/>
-            <w:r>
-              <w:rPr>
-                <w:rFonts w:ascii="Calibri" w:hAnsi="Calibri" w:eastAsia="Heiti TC"/>
-                <w:b/>
-                <w:color w:val="111827"/>
-                <w:sz w:val="17"/>
-              </w:rPr>
-              <w:t>40.8</w:t>
-            </w:r>
-          </w:p>
-        </w:tc>
-        <w:tc>
-          <w:tcPr>
-            <w:tcW w:type="dxa" w:w="1500"/>
-            <w:vAlign w:val="center"/>
-          </w:tcPr>
-          <w:p>
-            <w:pPr>
-              <w:spacing w:before="0" w:after="0"/>
-              <w:jc w:val="center"/>
-            </w:pPr>
-            <w:r/>
-            <w:r>
-              <w:rPr>
-                <w:rFonts w:ascii="Calibri" w:hAnsi="Calibri" w:eastAsia="Heiti TC"/>
-                <w:b w:val="0"/>
-                <w:color w:val="111827"/>
-                <w:sz w:val="16"/>
-              </w:rPr>
-              <w:t>风险 1</w:t>
-            </w:r>
-          </w:p>
-        </w:tc>
-      </w:tr>
-      <w:tr>
-        <w:tc>
-          <w:tcPr>
-            <w:tcW w:type="dxa" w:w="3720"/>
-            <w:vAlign w:val="center"/>
-          </w:tcPr>
-          <w:p>
-            <w:pPr>
-              <w:spacing w:before="0" w:after="0"/>
-            </w:pPr>
-            <w:r/>
-            <w:r>
-              <w:rPr>
-                <w:rFonts w:ascii="Calibri" w:hAnsi="Calibri" w:eastAsia="Heiti TC"/>
-                <w:b w:val="0"/>
-                <w:color w:val="111827"/>
-                <w:sz w:val="17"/>
-              </w:rPr>
-              <w:t>深度研究报告</w:t>
-            </w:r>
-          </w:p>
-        </w:tc>
-        <w:tc>
-          <w:tcPr>
-            <w:tcW w:type="dxa" w:w="1560"/>
-            <w:vAlign w:val="center"/>
-          </w:tcPr>
-          <w:p>
-            <w:pPr>
-              <w:spacing w:before="0" w:after="0"/>
-            </w:pPr>
-            <w:r/>
-            <w:r>
-              <w:rPr>
-                <w:rFonts w:ascii="Calibri" w:hAnsi="Calibri" w:eastAsia="Heiti TC"/>
-                <w:b w:val="0"/>
-                <w:color w:val="111827"/>
-                <w:sz w:val="16"/>
-              </w:rPr>
-              <w:t>未识别</w:t>
-            </w:r>
-          </w:p>
-        </w:tc>
-        <w:tc>
-          <w:tcPr>
-            <w:tcW w:type="dxa" w:w="1680"/>
-            <w:vAlign w:val="center"/>
-          </w:tcPr>
-          <w:p>
-            <w:pPr>
-              <w:spacing w:before="0" w:after="0"/>
-            </w:pPr>
-            <w:r/>
-            <w:r>
-              <w:rPr>
-                <w:rFonts w:ascii="Calibri" w:hAnsi="Calibri" w:eastAsia="Heiti TC"/>
-                <w:b w:val="0"/>
-                <w:color w:val="111827"/>
-                <w:sz w:val="16"/>
-              </w:rPr>
-              <w:t>宏观通胀传导</w:t>
-            </w:r>
-          </w:p>
-        </w:tc>
-        <w:tc>
-          <w:tcPr>
-            <w:tcW w:type="dxa" w:w="900"/>
-            <w:vAlign w:val="center"/>
-          </w:tcPr>
-          <w:p>
-            <w:pPr>
-              <w:spacing w:before="0" w:after="0"/>
-              <w:jc w:val="center"/>
-            </w:pPr>
-            <w:r/>
-            <w:r>
-              <w:rPr>
-                <w:rFonts w:ascii="Calibri" w:hAnsi="Calibri" w:eastAsia="Heiti TC"/>
-                <w:b/>
-                <w:color w:val="111827"/>
-                <w:sz w:val="17"/>
-              </w:rPr>
-              <w:t>40.7</w:t>
-            </w:r>
-          </w:p>
-        </w:tc>
-        <w:tc>
-          <w:tcPr>
-            <w:tcW w:type="dxa" w:w="1500"/>
-            <w:vAlign w:val="center"/>
-          </w:tcPr>
-          <w:p>
-            <w:pPr>
-              <w:spacing w:before="0" w:after="0"/>
-              <w:jc w:val="center"/>
-            </w:pPr>
-            <w:r/>
-            <w:r>
-              <w:rPr>
-                <w:rFonts w:ascii="Calibri" w:hAnsi="Calibri" w:eastAsia="Heiti TC"/>
-                <w:b w:val="0"/>
-                <w:color w:val="111827"/>
-                <w:sz w:val="16"/>
-              </w:rPr>
-              <w:t>风险 1</w:t>
-            </w:r>
-          </w:p>
-        </w:tc>
-      </w:tr>
-      <w:tr>
-        <w:tc>
-          <w:tcPr>
-            <w:tcW w:type="dxa" w:w="3720"/>
-            <w:vAlign w:val="center"/>
-          </w:tcPr>
-          <w:p>
-            <w:pPr>
-              <w:spacing w:before="0" w:after="0"/>
-            </w:pPr>
-            <w:r/>
-            <w:r>
-              <w:rPr>
-                <w:rFonts w:ascii="Calibri" w:hAnsi="Calibri" w:eastAsia="Heiti TC"/>
-                <w:b w:val="0"/>
-                <w:color w:val="111827"/>
-                <w:sz w:val="17"/>
-              </w:rPr>
-              <w:t>AI Capex 路径分化：从芯片驱动到内制芯片与"算力即可交易资产"</w:t>
-            </w:r>
-          </w:p>
-        </w:tc>
-        <w:tc>
-          <w:tcPr>
-            <w:tcW w:type="dxa" w:w="1560"/>
-            <w:vAlign w:val="center"/>
-          </w:tcPr>
-          <w:p>
-            <w:pPr>
-              <w:spacing w:before="0" w:after="0"/>
-            </w:pPr>
-            <w:r/>
-            <w:r>
-              <w:rPr>
-                <w:rFonts w:ascii="Calibri" w:hAnsi="Calibri" w:eastAsia="Heiti TC"/>
-                <w:b w:val="0"/>
-                <w:color w:val="111827"/>
-                <w:sz w:val="16"/>
-              </w:rPr>
-              <w:t>未识别</w:t>
-            </w:r>
-          </w:p>
-        </w:tc>
-        <w:tc>
-          <w:tcPr>
-            <w:tcW w:type="dxa" w:w="1680"/>
-            <w:vAlign w:val="center"/>
-          </w:tcPr>
-          <w:p>
-            <w:pPr>
-              <w:spacing w:before="0" w:after="0"/>
-            </w:pPr>
-            <w:r/>
-            <w:r>
-              <w:rPr>
-                <w:rFonts w:ascii="Calibri" w:hAnsi="Calibri" w:eastAsia="Heiti TC"/>
-                <w:b w:val="0"/>
-                <w:color w:val="111827"/>
-                <w:sz w:val="16"/>
-              </w:rPr>
-              <w:t>AI 基础设施</w:t>
-            </w:r>
-          </w:p>
-        </w:tc>
-        <w:tc>
-          <w:tcPr>
-            <w:tcW w:type="dxa" w:w="900"/>
-            <w:vAlign w:val="center"/>
-          </w:tcPr>
-          <w:p>
-            <w:pPr>
-              <w:spacing w:before="0" w:after="0"/>
-              <w:jc w:val="center"/>
-            </w:pPr>
-            <w:r/>
-            <w:r>
-              <w:rPr>
-                <w:rFonts w:ascii="Calibri" w:hAnsi="Calibri" w:eastAsia="Heiti TC"/>
-                <w:b/>
-                <w:color w:val="111827"/>
-                <w:sz w:val="17"/>
-              </w:rPr>
-              <w:t>40.5</w:t>
-            </w:r>
-          </w:p>
-        </w:tc>
-        <w:tc>
-          <w:tcPr>
-            <w:tcW w:type="dxa" w:w="1500"/>
-            <w:vAlign w:val="center"/>
-          </w:tcPr>
-          <w:p>
-            <w:pPr>
-              <w:spacing w:before="0" w:after="0"/>
-              <w:jc w:val="center"/>
-            </w:pPr>
-            <w:r/>
-            <w:r>
-              <w:rPr>
-                <w:rFonts w:ascii="Calibri" w:hAnsi="Calibri" w:eastAsia="Heiti TC"/>
-                <w:b w:val="0"/>
-                <w:color w:val="111827"/>
-                <w:sz w:val="16"/>
-              </w:rPr>
-              <w:t>风险 1</w:t>
-            </w:r>
-          </w:p>
-        </w:tc>
-      </w:tr>
-      <w:tr>
-        <w:tc>
-          <w:tcPr>
-            <w:tcW w:type="dxa" w:w="3720"/>
-            <w:vAlign w:val="center"/>
-          </w:tcPr>
-          <w:p>
-            <w:pPr>
-              <w:spacing w:before="0" w:after="0"/>
-            </w:pPr>
-            <w:r/>
-            <w:r>
-              <w:rPr>
-                <w:rFonts w:ascii="Calibri" w:hAnsi="Calibri" w:eastAsia="Heiti TC"/>
-                <w:b w:val="0"/>
-                <w:color w:val="111827"/>
-                <w:sz w:val="17"/>
-              </w:rPr>
-              <w:t>把因子监控转成最终A股执行表</w:t>
-            </w:r>
-          </w:p>
-        </w:tc>
-        <w:tc>
-          <w:tcPr>
-            <w:tcW w:type="dxa" w:w="1560"/>
-            <w:vAlign w:val="center"/>
-          </w:tcPr>
-          <w:p>
-            <w:pPr>
-              <w:spacing w:before="0" w:after="0"/>
-            </w:pPr>
-            <w:r/>
-            <w:r>
-              <w:rPr>
-                <w:rFonts w:ascii="Calibri" w:hAnsi="Calibri" w:eastAsia="Heiti TC"/>
-                <w:b w:val="0"/>
-                <w:color w:val="111827"/>
-                <w:sz w:val="16"/>
-              </w:rPr>
-              <w:t>未识别</w:t>
-            </w:r>
-          </w:p>
-        </w:tc>
-        <w:tc>
-          <w:tcPr>
-            <w:tcW w:type="dxa" w:w="1680"/>
-            <w:vAlign w:val="center"/>
-          </w:tcPr>
-          <w:p>
-            <w:pPr>
-              <w:spacing w:before="0" w:after="0"/>
-            </w:pPr>
-            <w:r/>
-            <w:r>
-              <w:rPr>
-                <w:rFonts w:ascii="Calibri" w:hAnsi="Calibri" w:eastAsia="Heiti TC"/>
-                <w:b w:val="0"/>
-                <w:color w:val="111827"/>
-                <w:sz w:val="16"/>
-              </w:rPr>
-              <w:t>宏观通胀传导</w:t>
-            </w:r>
-          </w:p>
-        </w:tc>
-        <w:tc>
-          <w:tcPr>
-            <w:tcW w:type="dxa" w:w="900"/>
-            <w:vAlign w:val="center"/>
-          </w:tcPr>
-          <w:p>
-            <w:pPr>
-              <w:spacing w:before="0" w:after="0"/>
-              <w:jc w:val="center"/>
-            </w:pPr>
-            <w:r/>
-            <w:r>
-              <w:rPr>
-                <w:rFonts w:ascii="Calibri" w:hAnsi="Calibri" w:eastAsia="Heiti TC"/>
-                <w:b/>
-                <w:color w:val="111827"/>
-                <w:sz w:val="17"/>
-              </w:rPr>
-              <w:t>40.4</w:t>
-            </w:r>
-          </w:p>
-        </w:tc>
-        <w:tc>
-          <w:tcPr>
-            <w:tcW w:type="dxa" w:w="1500"/>
-            <w:vAlign w:val="center"/>
-          </w:tcPr>
-          <w:p>
-            <w:pPr>
-              <w:spacing w:before="0" w:after="0"/>
-              <w:jc w:val="center"/>
-            </w:pPr>
-            <w:r/>
-            <w:r>
-              <w:rPr>
-                <w:rFonts w:ascii="Calibri" w:hAnsi="Calibri" w:eastAsia="Heiti TC"/>
-                <w:b w:val="0"/>
-                <w:color w:val="111827"/>
-                <w:sz w:val="16"/>
-              </w:rPr>
-              <w:t>风险 1</w:t>
             </w:r>
           </w:p>
         </w:tc>
@@ -3382,7 +3382,7 @@
       </w:pPr>
       <w:r>
         <w:rPr>
-          <w:rFonts w:ascii="Calibri" w:hAnsi="Calibri" w:eastAsia="Heiti TC"/>
+          <w:rFonts w:ascii="Calibri" w:hAnsi="Calibri" w:eastAsia="Arial Unicode MS"/>
           <w:b w:val="0"/>
           <w:i/>
           <w:color w:val="667085"/>
@@ -3412,7 +3412,7 @@
     </w:pPr>
     <w:r>
       <w:rPr>
-        <w:rFonts w:ascii="Calibri" w:hAnsi="Calibri" w:eastAsia="Heiti TC"/>
+        <w:rFonts w:ascii="Calibri" w:hAnsi="Calibri" w:eastAsia="Arial Unicode MS"/>
         <w:color w:val="667085"/>
         <w:sz w:val="17"/>
       </w:rPr>
@@ -3431,7 +3431,7 @@
     <w:r/>
     <w:r>
       <w:rPr>
-        <w:rFonts w:ascii="Calibri" w:hAnsi="Calibri" w:eastAsia="Heiti TC"/>
+        <w:rFonts w:ascii="Calibri" w:hAnsi="Calibri" w:eastAsia="Arial Unicode MS"/>
         <w:color w:val="667085"/>
         <w:sz w:val="18"/>
       </w:rPr>
@@ -3808,7 +3808,7 @@
       <w:spacing w:after="120" w:line="264" w:lineRule="auto"/>
     </w:pPr>
     <w:rPr>
-      <w:rFonts w:ascii="Calibri" w:hAnsi="Calibri" w:eastAsia="Heiti TC"/>
+      <w:rFonts w:ascii="Calibri" w:hAnsi="Calibri" w:eastAsia="Arial Unicode MS"/>
       <w:b w:val="0"/>
       <w:color w:val="111827"/>
       <w:sz w:val="22"/>
@@ -3873,7 +3873,7 @@
       <w:outlineLvl w:val="0"/>
     </w:pPr>
     <w:rPr>
-      <w:rFonts w:asciiTheme="majorHAnsi" w:eastAsiaTheme="majorEastAsia" w:hAnsiTheme="majorHAnsi" w:cstheme="majorBidi" w:ascii="Calibri" w:hAnsi="Calibri" w:eastAsia="Heiti TC"/>
+      <w:rFonts w:asciiTheme="majorHAnsi" w:eastAsiaTheme="majorEastAsia" w:hAnsiTheme="majorHAnsi" w:cstheme="majorBidi" w:ascii="Calibri" w:hAnsi="Calibri" w:eastAsia="Arial Unicode MS"/>
       <w:b/>
       <w:bCs/>
       <w:color w:val="2E74B5"/>
@@ -3897,7 +3897,7 @@
       <w:outlineLvl w:val="1"/>
     </w:pPr>
     <w:rPr>
-      <w:rFonts w:asciiTheme="majorHAnsi" w:eastAsiaTheme="majorEastAsia" w:hAnsiTheme="majorHAnsi" w:cstheme="majorBidi" w:ascii="Calibri" w:hAnsi="Calibri" w:eastAsia="Heiti TC"/>
+      <w:rFonts w:asciiTheme="majorHAnsi" w:eastAsiaTheme="majorEastAsia" w:hAnsiTheme="majorHAnsi" w:cstheme="majorBidi" w:ascii="Calibri" w:hAnsi="Calibri" w:eastAsia="Arial Unicode MS"/>
       <w:b/>
       <w:bCs/>
       <w:color w:val="2E74B5"/>
@@ -3921,7 +3921,7 @@
       <w:outlineLvl w:val="2"/>
     </w:pPr>
     <w:rPr>
-      <w:rFonts w:asciiTheme="majorHAnsi" w:eastAsiaTheme="majorEastAsia" w:hAnsiTheme="majorHAnsi" w:cstheme="majorBidi" w:ascii="Calibri" w:hAnsi="Calibri" w:eastAsia="Heiti TC"/>
+      <w:rFonts w:asciiTheme="majorHAnsi" w:eastAsiaTheme="majorEastAsia" w:hAnsiTheme="majorHAnsi" w:cstheme="majorBidi" w:ascii="Calibri" w:hAnsi="Calibri" w:eastAsia="Arial Unicode MS"/>
       <w:b/>
       <w:bCs/>
       <w:color w:val="1F4D78"/>
@@ -4163,7 +4163,7 @@
       <w:contextualSpacing/>
     </w:pPr>
     <w:rPr>
-      <w:rFonts w:asciiTheme="majorHAnsi" w:eastAsiaTheme="majorEastAsia" w:hAnsiTheme="majorHAnsi" w:cstheme="majorBidi" w:ascii="Calibri" w:hAnsi="Calibri" w:eastAsia="Heiti TC"/>
+      <w:rFonts w:asciiTheme="majorHAnsi" w:eastAsiaTheme="majorEastAsia" w:hAnsiTheme="majorHAnsi" w:cstheme="majorBidi" w:ascii="Calibri" w:hAnsi="Calibri" w:eastAsia="Arial Unicode MS"/>
       <w:b/>
       <w:color w:val="0B2545"/>
       <w:spacing w:val="5"/>
@@ -4201,7 +4201,7 @@
       </w:numPr>
     </w:pPr>
     <w:rPr>
-      <w:rFonts w:asciiTheme="majorHAnsi" w:eastAsiaTheme="majorEastAsia" w:hAnsiTheme="majorHAnsi" w:cstheme="majorBidi" w:ascii="Calibri" w:hAnsi="Calibri" w:eastAsia="Heiti TC"/>
+      <w:rFonts w:asciiTheme="majorHAnsi" w:eastAsiaTheme="majorEastAsia" w:hAnsiTheme="majorHAnsi" w:cstheme="majorBidi" w:ascii="Calibri" w:hAnsi="Calibri" w:eastAsia="Arial Unicode MS"/>
       <w:b w:val="0"/>
       <w:i/>
       <w:iCs/>

</xml_diff>